<commit_message>
edited typo in correlation matrix
</commit_message>
<xml_diff>
--- a/Output/Table_4_Correlation_Matrix.docx
+++ b/Output/Table_4_Correlation_Matrix.docx
@@ -27,10 +27,9 @@
       </w:tblGrid>
       <w:tr>
         <w:trPr>
-          <w:trHeight w:val="572" w:hRule="auto"/>
+          <w:trHeight w:val="638" w:hRule="auto"/>
           <w:tblHeader/>
         </w:trPr>
-        header1
         <w:tc>
           <w:tcPr>
             <w:tcBorders>
@@ -50,29 +49,30 @@
           </w:tcPr>
           <w:p>
             <w:pPr>
-              <w:jc w:val="left"/>
-              <w:pBdr>
-                <w:bottom w:val="none" w:sz="0" w:space="0" w:color="000000"/>
-                <w:top w:val="none" w:sz="0" w:space="0" w:color="000000"/>
-                <w:left w:val="none" w:sz="0" w:space="0" w:color="000000"/>
-                <w:right w:val="none" w:sz="0" w:space="0" w:color="000000"/>
-              </w:pBdr>
-              <w:spacing w:after="100" w:before="100" w:line="240"/>
-              <w:ind w:left="100" w:right="100" w:firstLine="0" w:firstLineChars="0"/>
-              <w:rPr>
-                <w:rFonts w:ascii="Arial" w:hAnsi="Arial" w:eastAsia="Arial" w:cs="Arial"/>
-                <w:i w:val="false"/>
-                <w:b w:val="false"/>
-                <w:u w:val="none"/>
-                <w:strike w:val="false"/>
-                <w:sz w:val="22"/>
-                <w:szCs w:val="22"/>
-                <w:color w:val="000000"/>
-              </w:rPr>
-            </w:pPr>
-            <w:r>
-              <w:rPr>
-                <w:rFonts w:ascii="Arial" w:hAnsi="Arial" w:eastAsia="Arial" w:cs="Arial"/>
+              <w:pStyle w:val="Normal"/>
+              <w:jc w:val="left"/>
+              <w:pBdr>
+                <w:bottom w:val="none" w:sz="0" w:space="0" w:color="000000"/>
+                <w:top w:val="none" w:sz="0" w:space="0" w:color="000000"/>
+                <w:left w:val="none" w:sz="0" w:space="0" w:color="000000"/>
+                <w:right w:val="none" w:sz="0" w:space="0" w:color="000000"/>
+              </w:pBdr>
+              <w:spacing w:after="100" w:before="100" w:line="240"/>
+              <w:ind w:left="100" w:right="100" w:firstLine="0" w:firstLineChars="0"/>
+              <w:rPr>
+                <w:rFonts w:ascii="Helvetica" w:hAnsi="Helvetica" w:eastAsia="Helvetica" w:cs="Helvetica"/>
+                <w:i w:val="false"/>
+                <w:b w:val="false"/>
+                <w:u w:val="none"/>
+                <w:strike w:val="false"/>
+                <w:sz w:val="22"/>
+                <w:szCs w:val="22"/>
+                <w:color w:val="000000"/>
+              </w:rPr>
+            </w:pPr>
+            <w:r>
+              <w:rPr>
+                <w:rFonts w:ascii="Helvetica" w:hAnsi="Helvetica" w:eastAsia="Helvetica" w:cs="Helvetica"/>
                 <w:i w:val="false"/>
                 <w:b w:val="false"/>
                 <w:u w:val="none"/>
@@ -104,29 +104,30 @@
           </w:tcPr>
           <w:p>
             <w:pPr>
-              <w:jc w:val="left"/>
-              <w:pBdr>
-                <w:bottom w:val="none" w:sz="0" w:space="0" w:color="000000"/>
-                <w:top w:val="none" w:sz="0" w:space="0" w:color="000000"/>
-                <w:left w:val="none" w:sz="0" w:space="0" w:color="000000"/>
-                <w:right w:val="none" w:sz="0" w:space="0" w:color="000000"/>
-              </w:pBdr>
-              <w:spacing w:after="100" w:before="100" w:line="240"/>
-              <w:ind w:left="100" w:right="100" w:firstLine="0" w:firstLineChars="0"/>
-              <w:rPr>
-                <w:rFonts w:ascii="Arial" w:hAnsi="Arial" w:eastAsia="Arial" w:cs="Arial"/>
-                <w:i w:val="false"/>
-                <w:b w:val="false"/>
-                <w:u w:val="none"/>
-                <w:strike w:val="false"/>
-                <w:sz w:val="22"/>
-                <w:szCs w:val="22"/>
-                <w:color w:val="000000"/>
-              </w:rPr>
-            </w:pPr>
-            <w:r>
-              <w:rPr>
-                <w:rFonts w:ascii="Arial" w:hAnsi="Arial" w:eastAsia="Arial" w:cs="Arial"/>
+              <w:pStyle w:val="Normal"/>
+              <w:jc w:val="left"/>
+              <w:pBdr>
+                <w:bottom w:val="none" w:sz="0" w:space="0" w:color="000000"/>
+                <w:top w:val="none" w:sz="0" w:space="0" w:color="000000"/>
+                <w:left w:val="none" w:sz="0" w:space="0" w:color="000000"/>
+                <w:right w:val="none" w:sz="0" w:space="0" w:color="000000"/>
+              </w:pBdr>
+              <w:spacing w:after="100" w:before="100" w:line="240"/>
+              <w:ind w:left="100" w:right="100" w:firstLine="0" w:firstLineChars="0"/>
+              <w:rPr>
+                <w:rFonts w:ascii="Helvetica" w:hAnsi="Helvetica" w:eastAsia="Helvetica" w:cs="Helvetica"/>
+                <w:i w:val="false"/>
+                <w:b w:val="false"/>
+                <w:u w:val="none"/>
+                <w:strike w:val="false"/>
+                <w:sz w:val="22"/>
+                <w:szCs w:val="22"/>
+                <w:color w:val="000000"/>
+              </w:rPr>
+            </w:pPr>
+            <w:r>
+              <w:rPr>
+                <w:rFonts w:ascii="Helvetica" w:hAnsi="Helvetica" w:eastAsia="Helvetica" w:cs="Helvetica"/>
                 <w:i w:val="false"/>
                 <w:b w:val="false"/>
                 <w:u w:val="none"/>
@@ -158,29 +159,30 @@
           </w:tcPr>
           <w:p>
             <w:pPr>
-              <w:jc w:val="left"/>
-              <w:pBdr>
-                <w:bottom w:val="none" w:sz="0" w:space="0" w:color="000000"/>
-                <w:top w:val="none" w:sz="0" w:space="0" w:color="000000"/>
-                <w:left w:val="none" w:sz="0" w:space="0" w:color="000000"/>
-                <w:right w:val="none" w:sz="0" w:space="0" w:color="000000"/>
-              </w:pBdr>
-              <w:spacing w:after="100" w:before="100" w:line="240"/>
-              <w:ind w:left="100" w:right="100" w:firstLine="0" w:firstLineChars="0"/>
-              <w:rPr>
-                <w:rFonts w:ascii="Arial" w:hAnsi="Arial" w:eastAsia="Arial" w:cs="Arial"/>
-                <w:i w:val="false"/>
-                <w:b w:val="false"/>
-                <w:u w:val="none"/>
-                <w:strike w:val="false"/>
-                <w:sz w:val="22"/>
-                <w:szCs w:val="22"/>
-                <w:color w:val="000000"/>
-              </w:rPr>
-            </w:pPr>
-            <w:r>
-              <w:rPr>
-                <w:rFonts w:ascii="Arial" w:hAnsi="Arial" w:eastAsia="Arial" w:cs="Arial"/>
+              <w:pStyle w:val="Normal"/>
+              <w:jc w:val="left"/>
+              <w:pBdr>
+                <w:bottom w:val="none" w:sz="0" w:space="0" w:color="000000"/>
+                <w:top w:val="none" w:sz="0" w:space="0" w:color="000000"/>
+                <w:left w:val="none" w:sz="0" w:space="0" w:color="000000"/>
+                <w:right w:val="none" w:sz="0" w:space="0" w:color="000000"/>
+              </w:pBdr>
+              <w:spacing w:after="100" w:before="100" w:line="240"/>
+              <w:ind w:left="100" w:right="100" w:firstLine="0" w:firstLineChars="0"/>
+              <w:rPr>
+                <w:rFonts w:ascii="Helvetica" w:hAnsi="Helvetica" w:eastAsia="Helvetica" w:cs="Helvetica"/>
+                <w:i w:val="false"/>
+                <w:b w:val="false"/>
+                <w:u w:val="none"/>
+                <w:strike w:val="false"/>
+                <w:sz w:val="22"/>
+                <w:szCs w:val="22"/>
+                <w:color w:val="000000"/>
+              </w:rPr>
+            </w:pPr>
+            <w:r>
+              <w:rPr>
+                <w:rFonts w:ascii="Helvetica" w:hAnsi="Helvetica" w:eastAsia="Helvetica" w:cs="Helvetica"/>
                 <w:i w:val="false"/>
                 <w:b w:val="false"/>
                 <w:u w:val="none"/>
@@ -212,29 +214,30 @@
           </w:tcPr>
           <w:p>
             <w:pPr>
-              <w:jc w:val="left"/>
-              <w:pBdr>
-                <w:bottom w:val="none" w:sz="0" w:space="0" w:color="000000"/>
-                <w:top w:val="none" w:sz="0" w:space="0" w:color="000000"/>
-                <w:left w:val="none" w:sz="0" w:space="0" w:color="000000"/>
-                <w:right w:val="none" w:sz="0" w:space="0" w:color="000000"/>
-              </w:pBdr>
-              <w:spacing w:after="100" w:before="100" w:line="240"/>
-              <w:ind w:left="100" w:right="100" w:firstLine="0" w:firstLineChars="0"/>
-              <w:rPr>
-                <w:rFonts w:ascii="Arial" w:hAnsi="Arial" w:eastAsia="Arial" w:cs="Arial"/>
-                <w:i w:val="false"/>
-                <w:b w:val="false"/>
-                <w:u w:val="none"/>
-                <w:strike w:val="false"/>
-                <w:sz w:val="22"/>
-                <w:szCs w:val="22"/>
-                <w:color w:val="000000"/>
-              </w:rPr>
-            </w:pPr>
-            <w:r>
-              <w:rPr>
-                <w:rFonts w:ascii="Arial" w:hAnsi="Arial" w:eastAsia="Arial" w:cs="Arial"/>
+              <w:pStyle w:val="Normal"/>
+              <w:jc w:val="left"/>
+              <w:pBdr>
+                <w:bottom w:val="none" w:sz="0" w:space="0" w:color="000000"/>
+                <w:top w:val="none" w:sz="0" w:space="0" w:color="000000"/>
+                <w:left w:val="none" w:sz="0" w:space="0" w:color="000000"/>
+                <w:right w:val="none" w:sz="0" w:space="0" w:color="000000"/>
+              </w:pBdr>
+              <w:spacing w:after="100" w:before="100" w:line="240"/>
+              <w:ind w:left="100" w:right="100" w:firstLine="0" w:firstLineChars="0"/>
+              <w:rPr>
+                <w:rFonts w:ascii="Helvetica" w:hAnsi="Helvetica" w:eastAsia="Helvetica" w:cs="Helvetica"/>
+                <w:i w:val="false"/>
+                <w:b w:val="false"/>
+                <w:u w:val="none"/>
+                <w:strike w:val="false"/>
+                <w:sz w:val="22"/>
+                <w:szCs w:val="22"/>
+                <w:color w:val="000000"/>
+              </w:rPr>
+            </w:pPr>
+            <w:r>
+              <w:rPr>
+                <w:rFonts w:ascii="Helvetica" w:hAnsi="Helvetica" w:eastAsia="Helvetica" w:cs="Helvetica"/>
                 <w:i w:val="false"/>
                 <w:b w:val="false"/>
                 <w:u w:val="none"/>
@@ -266,29 +269,30 @@
           </w:tcPr>
           <w:p>
             <w:pPr>
-              <w:jc w:val="left"/>
-              <w:pBdr>
-                <w:bottom w:val="none" w:sz="0" w:space="0" w:color="000000"/>
-                <w:top w:val="none" w:sz="0" w:space="0" w:color="000000"/>
-                <w:left w:val="none" w:sz="0" w:space="0" w:color="000000"/>
-                <w:right w:val="none" w:sz="0" w:space="0" w:color="000000"/>
-              </w:pBdr>
-              <w:spacing w:after="100" w:before="100" w:line="240"/>
-              <w:ind w:left="100" w:right="100" w:firstLine="0" w:firstLineChars="0"/>
-              <w:rPr>
-                <w:rFonts w:ascii="Arial" w:hAnsi="Arial" w:eastAsia="Arial" w:cs="Arial"/>
-                <w:i w:val="false"/>
-                <w:b w:val="false"/>
-                <w:u w:val="none"/>
-                <w:strike w:val="false"/>
-                <w:sz w:val="22"/>
-                <w:szCs w:val="22"/>
-                <w:color w:val="000000"/>
-              </w:rPr>
-            </w:pPr>
-            <w:r>
-              <w:rPr>
-                <w:rFonts w:ascii="Arial" w:hAnsi="Arial" w:eastAsia="Arial" w:cs="Arial"/>
+              <w:pStyle w:val="Normal"/>
+              <w:jc w:val="left"/>
+              <w:pBdr>
+                <w:bottom w:val="none" w:sz="0" w:space="0" w:color="000000"/>
+                <w:top w:val="none" w:sz="0" w:space="0" w:color="000000"/>
+                <w:left w:val="none" w:sz="0" w:space="0" w:color="000000"/>
+                <w:right w:val="none" w:sz="0" w:space="0" w:color="000000"/>
+              </w:pBdr>
+              <w:spacing w:after="100" w:before="100" w:line="240"/>
+              <w:ind w:left="100" w:right="100" w:firstLine="0" w:firstLineChars="0"/>
+              <w:rPr>
+                <w:rFonts w:ascii="Helvetica" w:hAnsi="Helvetica" w:eastAsia="Helvetica" w:cs="Helvetica"/>
+                <w:i w:val="false"/>
+                <w:b w:val="false"/>
+                <w:u w:val="none"/>
+                <w:strike w:val="false"/>
+                <w:sz w:val="22"/>
+                <w:szCs w:val="22"/>
+                <w:color w:val="000000"/>
+              </w:rPr>
+            </w:pPr>
+            <w:r>
+              <w:rPr>
+                <w:rFonts w:ascii="Helvetica" w:hAnsi="Helvetica" w:eastAsia="Helvetica" w:cs="Helvetica"/>
                 <w:i w:val="false"/>
                 <w:b w:val="false"/>
                 <w:u w:val="none"/>
@@ -320,29 +324,30 @@
           </w:tcPr>
           <w:p>
             <w:pPr>
-              <w:jc w:val="left"/>
-              <w:pBdr>
-                <w:bottom w:val="none" w:sz="0" w:space="0" w:color="000000"/>
-                <w:top w:val="none" w:sz="0" w:space="0" w:color="000000"/>
-                <w:left w:val="none" w:sz="0" w:space="0" w:color="000000"/>
-                <w:right w:val="none" w:sz="0" w:space="0" w:color="000000"/>
-              </w:pBdr>
-              <w:spacing w:after="100" w:before="100" w:line="240"/>
-              <w:ind w:left="100" w:right="100" w:firstLine="0" w:firstLineChars="0"/>
-              <w:rPr>
-                <w:rFonts w:ascii="Arial" w:hAnsi="Arial" w:eastAsia="Arial" w:cs="Arial"/>
-                <w:i w:val="false"/>
-                <w:b w:val="false"/>
-                <w:u w:val="none"/>
-                <w:strike w:val="false"/>
-                <w:sz w:val="22"/>
-                <w:szCs w:val="22"/>
-                <w:color w:val="000000"/>
-              </w:rPr>
-            </w:pPr>
-            <w:r>
-              <w:rPr>
-                <w:rFonts w:ascii="Arial" w:hAnsi="Arial" w:eastAsia="Arial" w:cs="Arial"/>
+              <w:pStyle w:val="Normal"/>
+              <w:jc w:val="left"/>
+              <w:pBdr>
+                <w:bottom w:val="none" w:sz="0" w:space="0" w:color="000000"/>
+                <w:top w:val="none" w:sz="0" w:space="0" w:color="000000"/>
+                <w:left w:val="none" w:sz="0" w:space="0" w:color="000000"/>
+                <w:right w:val="none" w:sz="0" w:space="0" w:color="000000"/>
+              </w:pBdr>
+              <w:spacing w:after="100" w:before="100" w:line="240"/>
+              <w:ind w:left="100" w:right="100" w:firstLine="0" w:firstLineChars="0"/>
+              <w:rPr>
+                <w:rFonts w:ascii="Helvetica" w:hAnsi="Helvetica" w:eastAsia="Helvetica" w:cs="Helvetica"/>
+                <w:i w:val="false"/>
+                <w:b w:val="false"/>
+                <w:u w:val="none"/>
+                <w:strike w:val="false"/>
+                <w:sz w:val="22"/>
+                <w:szCs w:val="22"/>
+                <w:color w:val="000000"/>
+              </w:rPr>
+            </w:pPr>
+            <w:r>
+              <w:rPr>
+                <w:rFonts w:ascii="Helvetica" w:hAnsi="Helvetica" w:eastAsia="Helvetica" w:cs="Helvetica"/>
                 <w:i w:val="false"/>
                 <w:b w:val="false"/>
                 <w:u w:val="none"/>
@@ -374,29 +379,30 @@
           </w:tcPr>
           <w:p>
             <w:pPr>
-              <w:jc w:val="left"/>
-              <w:pBdr>
-                <w:bottom w:val="none" w:sz="0" w:space="0" w:color="000000"/>
-                <w:top w:val="none" w:sz="0" w:space="0" w:color="000000"/>
-                <w:left w:val="none" w:sz="0" w:space="0" w:color="000000"/>
-                <w:right w:val="none" w:sz="0" w:space="0" w:color="000000"/>
-              </w:pBdr>
-              <w:spacing w:after="100" w:before="100" w:line="240"/>
-              <w:ind w:left="100" w:right="100" w:firstLine="0" w:firstLineChars="0"/>
-              <w:rPr>
-                <w:rFonts w:ascii="Arial" w:hAnsi="Arial" w:eastAsia="Arial" w:cs="Arial"/>
-                <w:i w:val="false"/>
-                <w:b w:val="false"/>
-                <w:u w:val="none"/>
-                <w:strike w:val="false"/>
-                <w:sz w:val="22"/>
-                <w:szCs w:val="22"/>
-                <w:color w:val="000000"/>
-              </w:rPr>
-            </w:pPr>
-            <w:r>
-              <w:rPr>
-                <w:rFonts w:ascii="Arial" w:hAnsi="Arial" w:eastAsia="Arial" w:cs="Arial"/>
+              <w:pStyle w:val="Normal"/>
+              <w:jc w:val="left"/>
+              <w:pBdr>
+                <w:bottom w:val="none" w:sz="0" w:space="0" w:color="000000"/>
+                <w:top w:val="none" w:sz="0" w:space="0" w:color="000000"/>
+                <w:left w:val="none" w:sz="0" w:space="0" w:color="000000"/>
+                <w:right w:val="none" w:sz="0" w:space="0" w:color="000000"/>
+              </w:pBdr>
+              <w:spacing w:after="100" w:before="100" w:line="240"/>
+              <w:ind w:left="100" w:right="100" w:firstLine="0" w:firstLineChars="0"/>
+              <w:rPr>
+                <w:rFonts w:ascii="Helvetica" w:hAnsi="Helvetica" w:eastAsia="Helvetica" w:cs="Helvetica"/>
+                <w:i w:val="false"/>
+                <w:b w:val="false"/>
+                <w:u w:val="none"/>
+                <w:strike w:val="false"/>
+                <w:sz w:val="22"/>
+                <w:szCs w:val="22"/>
+                <w:color w:val="000000"/>
+              </w:rPr>
+            </w:pPr>
+            <w:r>
+              <w:rPr>
+                <w:rFonts w:ascii="Helvetica" w:hAnsi="Helvetica" w:eastAsia="Helvetica" w:cs="Helvetica"/>
                 <w:i w:val="false"/>
                 <w:b w:val="false"/>
                 <w:u w:val="none"/>
@@ -412,9 +418,8 @@
       </w:tr>
       <w:tr>
         <w:trPr>
-          <w:trHeight w:val="615" w:hRule="auto"/>
+          <w:trHeight w:val="608" w:hRule="auto"/>
         </w:trPr>
-        body1
         <w:tc>
           <w:tcPr>
             <w:tcBorders>
@@ -434,29 +439,30 @@
           </w:tcPr>
           <w:p>
             <w:pPr>
-              <w:jc w:val="left"/>
-              <w:pBdr>
-                <w:bottom w:val="none" w:sz="0" w:space="0" w:color="000000"/>
-                <w:top w:val="none" w:sz="0" w:space="0" w:color="000000"/>
-                <w:left w:val="none" w:sz="0" w:space="0" w:color="000000"/>
-                <w:right w:val="none" w:sz="0" w:space="0" w:color="000000"/>
-              </w:pBdr>
-              <w:spacing w:after="100" w:before="100" w:line="240"/>
-              <w:ind w:left="100" w:right="100" w:firstLine="0" w:firstLineChars="0"/>
-              <w:rPr>
-                <w:rFonts w:ascii="Arial" w:hAnsi="Arial" w:eastAsia="Arial" w:cs="Arial"/>
-                <w:i w:val="false"/>
-                <w:b w:val="false"/>
-                <w:u w:val="none"/>
-                <w:strike w:val="false"/>
-                <w:sz w:val="22"/>
-                <w:szCs w:val="22"/>
-                <w:color w:val="000000"/>
-              </w:rPr>
-            </w:pPr>
-            <w:r>
-              <w:rPr>
-                <w:rFonts w:ascii="Arial" w:hAnsi="Arial" w:eastAsia="Arial" w:cs="Arial"/>
+              <w:pStyle w:val="Normal"/>
+              <w:jc w:val="left"/>
+              <w:pBdr>
+                <w:bottom w:val="none" w:sz="0" w:space="0" w:color="000000"/>
+                <w:top w:val="none" w:sz="0" w:space="0" w:color="000000"/>
+                <w:left w:val="none" w:sz="0" w:space="0" w:color="000000"/>
+                <w:right w:val="none" w:sz="0" w:space="0" w:color="000000"/>
+              </w:pBdr>
+              <w:spacing w:after="100" w:before="100" w:line="240"/>
+              <w:ind w:left="100" w:right="100" w:firstLine="0" w:firstLineChars="0"/>
+              <w:rPr>
+                <w:rFonts w:ascii="Helvetica" w:hAnsi="Helvetica" w:eastAsia="Helvetica" w:cs="Helvetica"/>
+                <w:i w:val="false"/>
+                <w:b w:val="false"/>
+                <w:u w:val="none"/>
+                <w:strike w:val="false"/>
+                <w:sz w:val="22"/>
+                <w:szCs w:val="22"/>
+                <w:color w:val="000000"/>
+              </w:rPr>
+            </w:pPr>
+            <w:r>
+              <w:rPr>
+                <w:rFonts w:ascii="Helvetica" w:hAnsi="Helvetica" w:eastAsia="Helvetica" w:cs="Helvetica"/>
                 <w:i w:val="false"/>
                 <w:b w:val="false"/>
                 <w:u w:val="none"/>
@@ -488,29 +494,30 @@
           </w:tcPr>
           <w:p>
             <w:pPr>
-              <w:jc w:val="left"/>
-              <w:pBdr>
-                <w:bottom w:val="none" w:sz="0" w:space="0" w:color="000000"/>
-                <w:top w:val="none" w:sz="0" w:space="0" w:color="000000"/>
-                <w:left w:val="none" w:sz="0" w:space="0" w:color="000000"/>
-                <w:right w:val="none" w:sz="0" w:space="0" w:color="000000"/>
-              </w:pBdr>
-              <w:spacing w:after="100" w:before="100" w:line="240"/>
-              <w:ind w:left="100" w:right="100" w:firstLine="0" w:firstLineChars="0"/>
-              <w:rPr>
-                <w:rFonts w:ascii="Arial" w:hAnsi="Arial" w:eastAsia="Arial" w:cs="Arial"/>
-                <w:i w:val="false"/>
-                <w:b w:val="false"/>
-                <w:u w:val="none"/>
-                <w:strike w:val="false"/>
-                <w:sz w:val="22"/>
-                <w:szCs w:val="22"/>
-                <w:color w:val="000000"/>
-              </w:rPr>
-            </w:pPr>
-            <w:r>
-              <w:rPr>
-                <w:rFonts w:ascii="Arial" w:hAnsi="Arial" w:eastAsia="Arial" w:cs="Arial"/>
+              <w:pStyle w:val="Normal"/>
+              <w:jc w:val="left"/>
+              <w:pBdr>
+                <w:bottom w:val="none" w:sz="0" w:space="0" w:color="000000"/>
+                <w:top w:val="none" w:sz="0" w:space="0" w:color="000000"/>
+                <w:left w:val="none" w:sz="0" w:space="0" w:color="000000"/>
+                <w:right w:val="none" w:sz="0" w:space="0" w:color="000000"/>
+              </w:pBdr>
+              <w:spacing w:after="100" w:before="100" w:line="240"/>
+              <w:ind w:left="100" w:right="100" w:firstLine="0" w:firstLineChars="0"/>
+              <w:rPr>
+                <w:rFonts w:ascii="Helvetica" w:hAnsi="Helvetica" w:eastAsia="Helvetica" w:cs="Helvetica"/>
+                <w:i w:val="false"/>
+                <w:b w:val="false"/>
+                <w:u w:val="none"/>
+                <w:strike w:val="false"/>
+                <w:sz w:val="22"/>
+                <w:szCs w:val="22"/>
+                <w:color w:val="000000"/>
+              </w:rPr>
+            </w:pPr>
+            <w:r>
+              <w:rPr>
+                <w:rFonts w:ascii="Helvetica" w:hAnsi="Helvetica" w:eastAsia="Helvetica" w:cs="Helvetica"/>
                 <w:i w:val="false"/>
                 <w:b w:val="false"/>
                 <w:u w:val="none"/>
@@ -542,29 +549,30 @@
           </w:tcPr>
           <w:p>
             <w:pPr>
-              <w:jc w:val="left"/>
-              <w:pBdr>
-                <w:bottom w:val="none" w:sz="0" w:space="0" w:color="000000"/>
-                <w:top w:val="none" w:sz="0" w:space="0" w:color="000000"/>
-                <w:left w:val="none" w:sz="0" w:space="0" w:color="000000"/>
-                <w:right w:val="none" w:sz="0" w:space="0" w:color="000000"/>
-              </w:pBdr>
-              <w:spacing w:after="100" w:before="100" w:line="240"/>
-              <w:ind w:left="100" w:right="100" w:firstLine="0" w:firstLineChars="0"/>
-              <w:rPr>
-                <w:rFonts w:ascii="Arial" w:hAnsi="Arial" w:eastAsia="Arial" w:cs="Arial"/>
-                <w:i w:val="false"/>
-                <w:b w:val="false"/>
-                <w:u w:val="none"/>
-                <w:strike w:val="false"/>
-                <w:sz w:val="22"/>
-                <w:szCs w:val="22"/>
-                <w:color w:val="000000"/>
-              </w:rPr>
-            </w:pPr>
-            <w:r>
-              <w:rPr>
-                <w:rFonts w:ascii="Arial" w:hAnsi="Arial" w:eastAsia="Arial" w:cs="Arial"/>
+              <w:pStyle w:val="Normal"/>
+              <w:jc w:val="left"/>
+              <w:pBdr>
+                <w:bottom w:val="none" w:sz="0" w:space="0" w:color="000000"/>
+                <w:top w:val="none" w:sz="0" w:space="0" w:color="000000"/>
+                <w:left w:val="none" w:sz="0" w:space="0" w:color="000000"/>
+                <w:right w:val="none" w:sz="0" w:space="0" w:color="000000"/>
+              </w:pBdr>
+              <w:spacing w:after="100" w:before="100" w:line="240"/>
+              <w:ind w:left="100" w:right="100" w:firstLine="0" w:firstLineChars="0"/>
+              <w:rPr>
+                <w:rFonts w:ascii="Helvetica" w:hAnsi="Helvetica" w:eastAsia="Helvetica" w:cs="Helvetica"/>
+                <w:i w:val="false"/>
+                <w:b w:val="false"/>
+                <w:u w:val="none"/>
+                <w:strike w:val="false"/>
+                <w:sz w:val="22"/>
+                <w:szCs w:val="22"/>
+                <w:color w:val="000000"/>
+              </w:rPr>
+            </w:pPr>
+            <w:r>
+              <w:rPr>
+                <w:rFonts w:ascii="Helvetica" w:hAnsi="Helvetica" w:eastAsia="Helvetica" w:cs="Helvetica"/>
                 <w:i w:val="false"/>
                 <w:b w:val="false"/>
                 <w:u w:val="none"/>
@@ -596,29 +604,30 @@
           </w:tcPr>
           <w:p>
             <w:pPr>
-              <w:jc w:val="left"/>
-              <w:pBdr>
-                <w:bottom w:val="none" w:sz="0" w:space="0" w:color="000000"/>
-                <w:top w:val="none" w:sz="0" w:space="0" w:color="000000"/>
-                <w:left w:val="none" w:sz="0" w:space="0" w:color="000000"/>
-                <w:right w:val="none" w:sz="0" w:space="0" w:color="000000"/>
-              </w:pBdr>
-              <w:spacing w:after="100" w:before="100" w:line="240"/>
-              <w:ind w:left="100" w:right="100" w:firstLine="0" w:firstLineChars="0"/>
-              <w:rPr>
-                <w:rFonts w:ascii="Arial" w:hAnsi="Arial" w:eastAsia="Arial" w:cs="Arial"/>
-                <w:i w:val="false"/>
-                <w:b w:val="false"/>
-                <w:u w:val="none"/>
-                <w:strike w:val="false"/>
-                <w:sz w:val="22"/>
-                <w:szCs w:val="22"/>
-                <w:color w:val="000000"/>
-              </w:rPr>
-            </w:pPr>
-            <w:r>
-              <w:rPr>
-                <w:rFonts w:ascii="Arial" w:hAnsi="Arial" w:eastAsia="Arial" w:cs="Arial"/>
+              <w:pStyle w:val="Normal"/>
+              <w:jc w:val="left"/>
+              <w:pBdr>
+                <w:bottom w:val="none" w:sz="0" w:space="0" w:color="000000"/>
+                <w:top w:val="none" w:sz="0" w:space="0" w:color="000000"/>
+                <w:left w:val="none" w:sz="0" w:space="0" w:color="000000"/>
+                <w:right w:val="none" w:sz="0" w:space="0" w:color="000000"/>
+              </w:pBdr>
+              <w:spacing w:after="100" w:before="100" w:line="240"/>
+              <w:ind w:left="100" w:right="100" w:firstLine="0" w:firstLineChars="0"/>
+              <w:rPr>
+                <w:rFonts w:ascii="Helvetica" w:hAnsi="Helvetica" w:eastAsia="Helvetica" w:cs="Helvetica"/>
+                <w:i w:val="false"/>
+                <w:b w:val="false"/>
+                <w:u w:val="none"/>
+                <w:strike w:val="false"/>
+                <w:sz w:val="22"/>
+                <w:szCs w:val="22"/>
+                <w:color w:val="000000"/>
+              </w:rPr>
+            </w:pPr>
+            <w:r>
+              <w:rPr>
+                <w:rFonts w:ascii="Helvetica" w:hAnsi="Helvetica" w:eastAsia="Helvetica" w:cs="Helvetica"/>
                 <w:i w:val="false"/>
                 <w:b w:val="false"/>
                 <w:u w:val="none"/>
@@ -650,29 +659,30 @@
           </w:tcPr>
           <w:p>
             <w:pPr>
-              <w:jc w:val="left"/>
-              <w:pBdr>
-                <w:bottom w:val="none" w:sz="0" w:space="0" w:color="000000"/>
-                <w:top w:val="none" w:sz="0" w:space="0" w:color="000000"/>
-                <w:left w:val="none" w:sz="0" w:space="0" w:color="000000"/>
-                <w:right w:val="none" w:sz="0" w:space="0" w:color="000000"/>
-              </w:pBdr>
-              <w:spacing w:after="100" w:before="100" w:line="240"/>
-              <w:ind w:left="100" w:right="100" w:firstLine="0" w:firstLineChars="0"/>
-              <w:rPr>
-                <w:rFonts w:ascii="Arial" w:hAnsi="Arial" w:eastAsia="Arial" w:cs="Arial"/>
-                <w:i w:val="false"/>
-                <w:b w:val="false"/>
-                <w:u w:val="none"/>
-                <w:strike w:val="false"/>
-                <w:sz w:val="22"/>
-                <w:szCs w:val="22"/>
-                <w:color w:val="000000"/>
-              </w:rPr>
-            </w:pPr>
-            <w:r>
-              <w:rPr>
-                <w:rFonts w:ascii="Arial" w:hAnsi="Arial" w:eastAsia="Arial" w:cs="Arial"/>
+              <w:pStyle w:val="Normal"/>
+              <w:jc w:val="left"/>
+              <w:pBdr>
+                <w:bottom w:val="none" w:sz="0" w:space="0" w:color="000000"/>
+                <w:top w:val="none" w:sz="0" w:space="0" w:color="000000"/>
+                <w:left w:val="none" w:sz="0" w:space="0" w:color="000000"/>
+                <w:right w:val="none" w:sz="0" w:space="0" w:color="000000"/>
+              </w:pBdr>
+              <w:spacing w:after="100" w:before="100" w:line="240"/>
+              <w:ind w:left="100" w:right="100" w:firstLine="0" w:firstLineChars="0"/>
+              <w:rPr>
+                <w:rFonts w:ascii="Helvetica" w:hAnsi="Helvetica" w:eastAsia="Helvetica" w:cs="Helvetica"/>
+                <w:i w:val="false"/>
+                <w:b w:val="false"/>
+                <w:u w:val="none"/>
+                <w:strike w:val="false"/>
+                <w:sz w:val="22"/>
+                <w:szCs w:val="22"/>
+                <w:color w:val="000000"/>
+              </w:rPr>
+            </w:pPr>
+            <w:r>
+              <w:rPr>
+                <w:rFonts w:ascii="Helvetica" w:hAnsi="Helvetica" w:eastAsia="Helvetica" w:cs="Helvetica"/>
                 <w:i w:val="false"/>
                 <w:b w:val="false"/>
                 <w:u w:val="none"/>
@@ -704,29 +714,30 @@
           </w:tcPr>
           <w:p>
             <w:pPr>
-              <w:jc w:val="left"/>
-              <w:pBdr>
-                <w:bottom w:val="none" w:sz="0" w:space="0" w:color="000000"/>
-                <w:top w:val="none" w:sz="0" w:space="0" w:color="000000"/>
-                <w:left w:val="none" w:sz="0" w:space="0" w:color="000000"/>
-                <w:right w:val="none" w:sz="0" w:space="0" w:color="000000"/>
-              </w:pBdr>
-              <w:spacing w:after="100" w:before="100" w:line="240"/>
-              <w:ind w:left="100" w:right="100" w:firstLine="0" w:firstLineChars="0"/>
-              <w:rPr>
-                <w:rFonts w:ascii="Arial" w:hAnsi="Arial" w:eastAsia="Arial" w:cs="Arial"/>
-                <w:i w:val="false"/>
-                <w:b w:val="false"/>
-                <w:u w:val="none"/>
-                <w:strike w:val="false"/>
-                <w:sz w:val="22"/>
-                <w:szCs w:val="22"/>
-                <w:color w:val="000000"/>
-              </w:rPr>
-            </w:pPr>
-            <w:r>
-              <w:rPr>
-                <w:rFonts w:ascii="Arial" w:hAnsi="Arial" w:eastAsia="Arial" w:cs="Arial"/>
+              <w:pStyle w:val="Normal"/>
+              <w:jc w:val="left"/>
+              <w:pBdr>
+                <w:bottom w:val="none" w:sz="0" w:space="0" w:color="000000"/>
+                <w:top w:val="none" w:sz="0" w:space="0" w:color="000000"/>
+                <w:left w:val="none" w:sz="0" w:space="0" w:color="000000"/>
+                <w:right w:val="none" w:sz="0" w:space="0" w:color="000000"/>
+              </w:pBdr>
+              <w:spacing w:after="100" w:before="100" w:line="240"/>
+              <w:ind w:left="100" w:right="100" w:firstLine="0" w:firstLineChars="0"/>
+              <w:rPr>
+                <w:rFonts w:ascii="Helvetica" w:hAnsi="Helvetica" w:eastAsia="Helvetica" w:cs="Helvetica"/>
+                <w:i w:val="false"/>
+                <w:b w:val="false"/>
+                <w:u w:val="none"/>
+                <w:strike w:val="false"/>
+                <w:sz w:val="22"/>
+                <w:szCs w:val="22"/>
+                <w:color w:val="000000"/>
+              </w:rPr>
+            </w:pPr>
+            <w:r>
+              <w:rPr>
+                <w:rFonts w:ascii="Helvetica" w:hAnsi="Helvetica" w:eastAsia="Helvetica" w:cs="Helvetica"/>
                 <w:i w:val="false"/>
                 <w:b w:val="false"/>
                 <w:u w:val="none"/>
@@ -758,29 +769,30 @@
           </w:tcPr>
           <w:p>
             <w:pPr>
-              <w:jc w:val="left"/>
-              <w:pBdr>
-                <w:bottom w:val="none" w:sz="0" w:space="0" w:color="000000"/>
-                <w:top w:val="none" w:sz="0" w:space="0" w:color="000000"/>
-                <w:left w:val="none" w:sz="0" w:space="0" w:color="000000"/>
-                <w:right w:val="none" w:sz="0" w:space="0" w:color="000000"/>
-              </w:pBdr>
-              <w:spacing w:after="100" w:before="100" w:line="240"/>
-              <w:ind w:left="100" w:right="100" w:firstLine="0" w:firstLineChars="0"/>
-              <w:rPr>
-                <w:rFonts w:ascii="Arial" w:hAnsi="Arial" w:eastAsia="Arial" w:cs="Arial"/>
-                <w:i w:val="false"/>
-                <w:b w:val="false"/>
-                <w:u w:val="none"/>
-                <w:strike w:val="false"/>
-                <w:sz w:val="22"/>
-                <w:szCs w:val="22"/>
-                <w:color w:val="000000"/>
-              </w:rPr>
-            </w:pPr>
-            <w:r>
-              <w:rPr>
-                <w:rFonts w:ascii="Arial" w:hAnsi="Arial" w:eastAsia="Arial" w:cs="Arial"/>
+              <w:pStyle w:val="Normal"/>
+              <w:jc w:val="left"/>
+              <w:pBdr>
+                <w:bottom w:val="none" w:sz="0" w:space="0" w:color="000000"/>
+                <w:top w:val="none" w:sz="0" w:space="0" w:color="000000"/>
+                <w:left w:val="none" w:sz="0" w:space="0" w:color="000000"/>
+                <w:right w:val="none" w:sz="0" w:space="0" w:color="000000"/>
+              </w:pBdr>
+              <w:spacing w:after="100" w:before="100" w:line="240"/>
+              <w:ind w:left="100" w:right="100" w:firstLine="0" w:firstLineChars="0"/>
+              <w:rPr>
+                <w:rFonts w:ascii="Helvetica" w:hAnsi="Helvetica" w:eastAsia="Helvetica" w:cs="Helvetica"/>
+                <w:i w:val="false"/>
+                <w:b w:val="false"/>
+                <w:u w:val="none"/>
+                <w:strike w:val="false"/>
+                <w:sz w:val="22"/>
+                <w:szCs w:val="22"/>
+                <w:color w:val="000000"/>
+              </w:rPr>
+            </w:pPr>
+            <w:r>
+              <w:rPr>
+                <w:rFonts w:ascii="Helvetica" w:hAnsi="Helvetica" w:eastAsia="Helvetica" w:cs="Helvetica"/>
                 <w:i w:val="false"/>
                 <w:b w:val="false"/>
                 <w:u w:val="none"/>
@@ -796,9 +808,8 @@
       </w:tr>
       <w:tr>
         <w:trPr>
-          <w:trHeight w:val="612" w:hRule="auto"/>
+          <w:trHeight w:val="608" w:hRule="auto"/>
         </w:trPr>
-        body2
         <w:tc>
           <w:tcPr>
             <w:tcBorders>
@@ -818,29 +829,30 @@
           </w:tcPr>
           <w:p>
             <w:pPr>
-              <w:jc w:val="left"/>
-              <w:pBdr>
-                <w:bottom w:val="none" w:sz="0" w:space="0" w:color="000000"/>
-                <w:top w:val="none" w:sz="0" w:space="0" w:color="000000"/>
-                <w:left w:val="none" w:sz="0" w:space="0" w:color="000000"/>
-                <w:right w:val="none" w:sz="0" w:space="0" w:color="000000"/>
-              </w:pBdr>
-              <w:spacing w:after="100" w:before="100" w:line="240"/>
-              <w:ind w:left="100" w:right="100" w:firstLine="0" w:firstLineChars="0"/>
-              <w:rPr>
-                <w:rFonts w:ascii="Arial" w:hAnsi="Arial" w:eastAsia="Arial" w:cs="Arial"/>
-                <w:i w:val="false"/>
-                <w:b w:val="false"/>
-                <w:u w:val="none"/>
-                <w:strike w:val="false"/>
-                <w:sz w:val="22"/>
-                <w:szCs w:val="22"/>
-                <w:color w:val="000000"/>
-              </w:rPr>
-            </w:pPr>
-            <w:r>
-              <w:rPr>
-                <w:rFonts w:ascii="Arial" w:hAnsi="Arial" w:eastAsia="Arial" w:cs="Arial"/>
+              <w:pStyle w:val="Normal"/>
+              <w:jc w:val="left"/>
+              <w:pBdr>
+                <w:bottom w:val="none" w:sz="0" w:space="0" w:color="000000"/>
+                <w:top w:val="none" w:sz="0" w:space="0" w:color="000000"/>
+                <w:left w:val="none" w:sz="0" w:space="0" w:color="000000"/>
+                <w:right w:val="none" w:sz="0" w:space="0" w:color="000000"/>
+              </w:pBdr>
+              <w:spacing w:after="100" w:before="100" w:line="240"/>
+              <w:ind w:left="100" w:right="100" w:firstLine="0" w:firstLineChars="0"/>
+              <w:rPr>
+                <w:rFonts w:ascii="Helvetica" w:hAnsi="Helvetica" w:eastAsia="Helvetica" w:cs="Helvetica"/>
+                <w:i w:val="false"/>
+                <w:b w:val="false"/>
+                <w:u w:val="none"/>
+                <w:strike w:val="false"/>
+                <w:sz w:val="22"/>
+                <w:szCs w:val="22"/>
+                <w:color w:val="000000"/>
+              </w:rPr>
+            </w:pPr>
+            <w:r>
+              <w:rPr>
+                <w:rFonts w:ascii="Helvetica" w:hAnsi="Helvetica" w:eastAsia="Helvetica" w:cs="Helvetica"/>
                 <w:i w:val="false"/>
                 <w:b w:val="false"/>
                 <w:u w:val="none"/>
@@ -872,29 +884,30 @@
           </w:tcPr>
           <w:p>
             <w:pPr>
-              <w:jc w:val="left"/>
-              <w:pBdr>
-                <w:bottom w:val="none" w:sz="0" w:space="0" w:color="000000"/>
-                <w:top w:val="none" w:sz="0" w:space="0" w:color="000000"/>
-                <w:left w:val="none" w:sz="0" w:space="0" w:color="000000"/>
-                <w:right w:val="none" w:sz="0" w:space="0" w:color="000000"/>
-              </w:pBdr>
-              <w:spacing w:after="100" w:before="100" w:line="240"/>
-              <w:ind w:left="100" w:right="100" w:firstLine="0" w:firstLineChars="0"/>
-              <w:rPr>
-                <w:rFonts w:ascii="Arial" w:hAnsi="Arial" w:eastAsia="Arial" w:cs="Arial"/>
-                <w:i w:val="false"/>
-                <w:b w:val="false"/>
-                <w:u w:val="none"/>
-                <w:strike w:val="false"/>
-                <w:sz w:val="22"/>
-                <w:szCs w:val="22"/>
-                <w:color w:val="000000"/>
-              </w:rPr>
-            </w:pPr>
-            <w:r>
-              <w:rPr>
-                <w:rFonts w:ascii="Arial" w:hAnsi="Arial" w:eastAsia="Arial" w:cs="Arial"/>
+              <w:pStyle w:val="Normal"/>
+              <w:jc w:val="left"/>
+              <w:pBdr>
+                <w:bottom w:val="none" w:sz="0" w:space="0" w:color="000000"/>
+                <w:top w:val="none" w:sz="0" w:space="0" w:color="000000"/>
+                <w:left w:val="none" w:sz="0" w:space="0" w:color="000000"/>
+                <w:right w:val="none" w:sz="0" w:space="0" w:color="000000"/>
+              </w:pBdr>
+              <w:spacing w:after="100" w:before="100" w:line="240"/>
+              <w:ind w:left="100" w:right="100" w:firstLine="0" w:firstLineChars="0"/>
+              <w:rPr>
+                <w:rFonts w:ascii="Helvetica" w:hAnsi="Helvetica" w:eastAsia="Helvetica" w:cs="Helvetica"/>
+                <w:i w:val="false"/>
+                <w:b w:val="false"/>
+                <w:u w:val="none"/>
+                <w:strike w:val="false"/>
+                <w:sz w:val="22"/>
+                <w:szCs w:val="22"/>
+                <w:color w:val="000000"/>
+              </w:rPr>
+            </w:pPr>
+            <w:r>
+              <w:rPr>
+                <w:rFonts w:ascii="Helvetica" w:hAnsi="Helvetica" w:eastAsia="Helvetica" w:cs="Helvetica"/>
                 <w:i w:val="false"/>
                 <w:b w:val="false"/>
                 <w:u w:val="none"/>
@@ -926,29 +939,30 @@
           </w:tcPr>
           <w:p>
             <w:pPr>
-              <w:jc w:val="left"/>
-              <w:pBdr>
-                <w:bottom w:val="none" w:sz="0" w:space="0" w:color="000000"/>
-                <w:top w:val="none" w:sz="0" w:space="0" w:color="000000"/>
-                <w:left w:val="none" w:sz="0" w:space="0" w:color="000000"/>
-                <w:right w:val="none" w:sz="0" w:space="0" w:color="000000"/>
-              </w:pBdr>
-              <w:spacing w:after="100" w:before="100" w:line="240"/>
-              <w:ind w:left="100" w:right="100" w:firstLine="0" w:firstLineChars="0"/>
-              <w:rPr>
-                <w:rFonts w:ascii="Arial" w:hAnsi="Arial" w:eastAsia="Arial" w:cs="Arial"/>
-                <w:i w:val="false"/>
-                <w:b w:val="false"/>
-                <w:u w:val="none"/>
-                <w:strike w:val="false"/>
-                <w:sz w:val="22"/>
-                <w:szCs w:val="22"/>
-                <w:color w:val="000000"/>
-              </w:rPr>
-            </w:pPr>
-            <w:r>
-              <w:rPr>
-                <w:rFonts w:ascii="Arial" w:hAnsi="Arial" w:eastAsia="Arial" w:cs="Arial"/>
+              <w:pStyle w:val="Normal"/>
+              <w:jc w:val="left"/>
+              <w:pBdr>
+                <w:bottom w:val="none" w:sz="0" w:space="0" w:color="000000"/>
+                <w:top w:val="none" w:sz="0" w:space="0" w:color="000000"/>
+                <w:left w:val="none" w:sz="0" w:space="0" w:color="000000"/>
+                <w:right w:val="none" w:sz="0" w:space="0" w:color="000000"/>
+              </w:pBdr>
+              <w:spacing w:after="100" w:before="100" w:line="240"/>
+              <w:ind w:left="100" w:right="100" w:firstLine="0" w:firstLineChars="0"/>
+              <w:rPr>
+                <w:rFonts w:ascii="Helvetica" w:hAnsi="Helvetica" w:eastAsia="Helvetica" w:cs="Helvetica"/>
+                <w:i w:val="false"/>
+                <w:b w:val="false"/>
+                <w:u w:val="none"/>
+                <w:strike w:val="false"/>
+                <w:sz w:val="22"/>
+                <w:szCs w:val="22"/>
+                <w:color w:val="000000"/>
+              </w:rPr>
+            </w:pPr>
+            <w:r>
+              <w:rPr>
+                <w:rFonts w:ascii="Helvetica" w:hAnsi="Helvetica" w:eastAsia="Helvetica" w:cs="Helvetica"/>
                 <w:i w:val="false"/>
                 <w:b w:val="false"/>
                 <w:u w:val="none"/>
@@ -980,29 +994,30 @@
           </w:tcPr>
           <w:p>
             <w:pPr>
-              <w:jc w:val="left"/>
-              <w:pBdr>
-                <w:bottom w:val="none" w:sz="0" w:space="0" w:color="000000"/>
-                <w:top w:val="none" w:sz="0" w:space="0" w:color="000000"/>
-                <w:left w:val="none" w:sz="0" w:space="0" w:color="000000"/>
-                <w:right w:val="none" w:sz="0" w:space="0" w:color="000000"/>
-              </w:pBdr>
-              <w:spacing w:after="100" w:before="100" w:line="240"/>
-              <w:ind w:left="100" w:right="100" w:firstLine="0" w:firstLineChars="0"/>
-              <w:rPr>
-                <w:rFonts w:ascii="Arial" w:hAnsi="Arial" w:eastAsia="Arial" w:cs="Arial"/>
-                <w:i w:val="false"/>
-                <w:b w:val="false"/>
-                <w:u w:val="none"/>
-                <w:strike w:val="false"/>
-                <w:sz w:val="22"/>
-                <w:szCs w:val="22"/>
-                <w:color w:val="000000"/>
-              </w:rPr>
-            </w:pPr>
-            <w:r>
-              <w:rPr>
-                <w:rFonts w:ascii="Arial" w:hAnsi="Arial" w:eastAsia="Arial" w:cs="Arial"/>
+              <w:pStyle w:val="Normal"/>
+              <w:jc w:val="left"/>
+              <w:pBdr>
+                <w:bottom w:val="none" w:sz="0" w:space="0" w:color="000000"/>
+                <w:top w:val="none" w:sz="0" w:space="0" w:color="000000"/>
+                <w:left w:val="none" w:sz="0" w:space="0" w:color="000000"/>
+                <w:right w:val="none" w:sz="0" w:space="0" w:color="000000"/>
+              </w:pBdr>
+              <w:spacing w:after="100" w:before="100" w:line="240"/>
+              <w:ind w:left="100" w:right="100" w:firstLine="0" w:firstLineChars="0"/>
+              <w:rPr>
+                <w:rFonts w:ascii="Helvetica" w:hAnsi="Helvetica" w:eastAsia="Helvetica" w:cs="Helvetica"/>
+                <w:i w:val="false"/>
+                <w:b w:val="false"/>
+                <w:u w:val="none"/>
+                <w:strike w:val="false"/>
+                <w:sz w:val="22"/>
+                <w:szCs w:val="22"/>
+                <w:color w:val="000000"/>
+              </w:rPr>
+            </w:pPr>
+            <w:r>
+              <w:rPr>
+                <w:rFonts w:ascii="Helvetica" w:hAnsi="Helvetica" w:eastAsia="Helvetica" w:cs="Helvetica"/>
                 <w:i w:val="false"/>
                 <w:b w:val="false"/>
                 <w:u w:val="none"/>
@@ -1034,29 +1049,30 @@
           </w:tcPr>
           <w:p>
             <w:pPr>
-              <w:jc w:val="left"/>
-              <w:pBdr>
-                <w:bottom w:val="none" w:sz="0" w:space="0" w:color="000000"/>
-                <w:top w:val="none" w:sz="0" w:space="0" w:color="000000"/>
-                <w:left w:val="none" w:sz="0" w:space="0" w:color="000000"/>
-                <w:right w:val="none" w:sz="0" w:space="0" w:color="000000"/>
-              </w:pBdr>
-              <w:spacing w:after="100" w:before="100" w:line="240"/>
-              <w:ind w:left="100" w:right="100" w:firstLine="0" w:firstLineChars="0"/>
-              <w:rPr>
-                <w:rFonts w:ascii="Arial" w:hAnsi="Arial" w:eastAsia="Arial" w:cs="Arial"/>
-                <w:i w:val="false"/>
-                <w:b w:val="false"/>
-                <w:u w:val="none"/>
-                <w:strike w:val="false"/>
-                <w:sz w:val="22"/>
-                <w:szCs w:val="22"/>
-                <w:color w:val="000000"/>
-              </w:rPr>
-            </w:pPr>
-            <w:r>
-              <w:rPr>
-                <w:rFonts w:ascii="Arial" w:hAnsi="Arial" w:eastAsia="Arial" w:cs="Arial"/>
+              <w:pStyle w:val="Normal"/>
+              <w:jc w:val="left"/>
+              <w:pBdr>
+                <w:bottom w:val="none" w:sz="0" w:space="0" w:color="000000"/>
+                <w:top w:val="none" w:sz="0" w:space="0" w:color="000000"/>
+                <w:left w:val="none" w:sz="0" w:space="0" w:color="000000"/>
+                <w:right w:val="none" w:sz="0" w:space="0" w:color="000000"/>
+              </w:pBdr>
+              <w:spacing w:after="100" w:before="100" w:line="240"/>
+              <w:ind w:left="100" w:right="100" w:firstLine="0" w:firstLineChars="0"/>
+              <w:rPr>
+                <w:rFonts w:ascii="Helvetica" w:hAnsi="Helvetica" w:eastAsia="Helvetica" w:cs="Helvetica"/>
+                <w:i w:val="false"/>
+                <w:b w:val="false"/>
+                <w:u w:val="none"/>
+                <w:strike w:val="false"/>
+                <w:sz w:val="22"/>
+                <w:szCs w:val="22"/>
+                <w:color w:val="000000"/>
+              </w:rPr>
+            </w:pPr>
+            <w:r>
+              <w:rPr>
+                <w:rFonts w:ascii="Helvetica" w:hAnsi="Helvetica" w:eastAsia="Helvetica" w:cs="Helvetica"/>
                 <w:i w:val="false"/>
                 <w:b w:val="false"/>
                 <w:u w:val="none"/>
@@ -1088,29 +1104,30 @@
           </w:tcPr>
           <w:p>
             <w:pPr>
-              <w:jc w:val="left"/>
-              <w:pBdr>
-                <w:bottom w:val="none" w:sz="0" w:space="0" w:color="000000"/>
-                <w:top w:val="none" w:sz="0" w:space="0" w:color="000000"/>
-                <w:left w:val="none" w:sz="0" w:space="0" w:color="000000"/>
-                <w:right w:val="none" w:sz="0" w:space="0" w:color="000000"/>
-              </w:pBdr>
-              <w:spacing w:after="100" w:before="100" w:line="240"/>
-              <w:ind w:left="100" w:right="100" w:firstLine="0" w:firstLineChars="0"/>
-              <w:rPr>
-                <w:rFonts w:ascii="Arial" w:hAnsi="Arial" w:eastAsia="Arial" w:cs="Arial"/>
-                <w:i w:val="false"/>
-                <w:b w:val="false"/>
-                <w:u w:val="none"/>
-                <w:strike w:val="false"/>
-                <w:sz w:val="22"/>
-                <w:szCs w:val="22"/>
-                <w:color w:val="000000"/>
-              </w:rPr>
-            </w:pPr>
-            <w:r>
-              <w:rPr>
-                <w:rFonts w:ascii="Arial" w:hAnsi="Arial" w:eastAsia="Arial" w:cs="Arial"/>
+              <w:pStyle w:val="Normal"/>
+              <w:jc w:val="left"/>
+              <w:pBdr>
+                <w:bottom w:val="none" w:sz="0" w:space="0" w:color="000000"/>
+                <w:top w:val="none" w:sz="0" w:space="0" w:color="000000"/>
+                <w:left w:val="none" w:sz="0" w:space="0" w:color="000000"/>
+                <w:right w:val="none" w:sz="0" w:space="0" w:color="000000"/>
+              </w:pBdr>
+              <w:spacing w:after="100" w:before="100" w:line="240"/>
+              <w:ind w:left="100" w:right="100" w:firstLine="0" w:firstLineChars="0"/>
+              <w:rPr>
+                <w:rFonts w:ascii="Helvetica" w:hAnsi="Helvetica" w:eastAsia="Helvetica" w:cs="Helvetica"/>
+                <w:i w:val="false"/>
+                <w:b w:val="false"/>
+                <w:u w:val="none"/>
+                <w:strike w:val="false"/>
+                <w:sz w:val="22"/>
+                <w:szCs w:val="22"/>
+                <w:color w:val="000000"/>
+              </w:rPr>
+            </w:pPr>
+            <w:r>
+              <w:rPr>
+                <w:rFonts w:ascii="Helvetica" w:hAnsi="Helvetica" w:eastAsia="Helvetica" w:cs="Helvetica"/>
                 <w:i w:val="false"/>
                 <w:b w:val="false"/>
                 <w:u w:val="none"/>
@@ -1142,29 +1159,30 @@
           </w:tcPr>
           <w:p>
             <w:pPr>
-              <w:jc w:val="left"/>
-              <w:pBdr>
-                <w:bottom w:val="none" w:sz="0" w:space="0" w:color="000000"/>
-                <w:top w:val="none" w:sz="0" w:space="0" w:color="000000"/>
-                <w:left w:val="none" w:sz="0" w:space="0" w:color="000000"/>
-                <w:right w:val="none" w:sz="0" w:space="0" w:color="000000"/>
-              </w:pBdr>
-              <w:spacing w:after="100" w:before="100" w:line="240"/>
-              <w:ind w:left="100" w:right="100" w:firstLine="0" w:firstLineChars="0"/>
-              <w:rPr>
-                <w:rFonts w:ascii="Arial" w:hAnsi="Arial" w:eastAsia="Arial" w:cs="Arial"/>
-                <w:i w:val="false"/>
-                <w:b w:val="false"/>
-                <w:u w:val="none"/>
-                <w:strike w:val="false"/>
-                <w:sz w:val="22"/>
-                <w:szCs w:val="22"/>
-                <w:color w:val="000000"/>
-              </w:rPr>
-            </w:pPr>
-            <w:r>
-              <w:rPr>
-                <w:rFonts w:ascii="Arial" w:hAnsi="Arial" w:eastAsia="Arial" w:cs="Arial"/>
+              <w:pStyle w:val="Normal"/>
+              <w:jc w:val="left"/>
+              <w:pBdr>
+                <w:bottom w:val="none" w:sz="0" w:space="0" w:color="000000"/>
+                <w:top w:val="none" w:sz="0" w:space="0" w:color="000000"/>
+                <w:left w:val="none" w:sz="0" w:space="0" w:color="000000"/>
+                <w:right w:val="none" w:sz="0" w:space="0" w:color="000000"/>
+              </w:pBdr>
+              <w:spacing w:after="100" w:before="100" w:line="240"/>
+              <w:ind w:left="100" w:right="100" w:firstLine="0" w:firstLineChars="0"/>
+              <w:rPr>
+                <w:rFonts w:ascii="Helvetica" w:hAnsi="Helvetica" w:eastAsia="Helvetica" w:cs="Helvetica"/>
+                <w:i w:val="false"/>
+                <w:b w:val="false"/>
+                <w:u w:val="none"/>
+                <w:strike w:val="false"/>
+                <w:sz w:val="22"/>
+                <w:szCs w:val="22"/>
+                <w:color w:val="000000"/>
+              </w:rPr>
+            </w:pPr>
+            <w:r>
+              <w:rPr>
+                <w:rFonts w:ascii="Helvetica" w:hAnsi="Helvetica" w:eastAsia="Helvetica" w:cs="Helvetica"/>
                 <w:i w:val="false"/>
                 <w:b w:val="false"/>
                 <w:u w:val="none"/>
@@ -1180,9 +1198,8 @@
       </w:tr>
       <w:tr>
         <w:trPr>
-          <w:trHeight w:val="574" w:hRule="auto"/>
+          <w:trHeight w:val="608" w:hRule="auto"/>
         </w:trPr>
-        body3
         <w:tc>
           <w:tcPr>
             <w:tcBorders>
@@ -1202,29 +1219,30 @@
           </w:tcPr>
           <w:p>
             <w:pPr>
-              <w:jc w:val="left"/>
-              <w:pBdr>
-                <w:bottom w:val="none" w:sz="0" w:space="0" w:color="000000"/>
-                <w:top w:val="none" w:sz="0" w:space="0" w:color="000000"/>
-                <w:left w:val="none" w:sz="0" w:space="0" w:color="000000"/>
-                <w:right w:val="none" w:sz="0" w:space="0" w:color="000000"/>
-              </w:pBdr>
-              <w:spacing w:after="100" w:before="100" w:line="240"/>
-              <w:ind w:left="100" w:right="100" w:firstLine="0" w:firstLineChars="0"/>
-              <w:rPr>
-                <w:rFonts w:ascii="Arial" w:hAnsi="Arial" w:eastAsia="Arial" w:cs="Arial"/>
-                <w:i w:val="false"/>
-                <w:b w:val="false"/>
-                <w:u w:val="none"/>
-                <w:strike w:val="false"/>
-                <w:sz w:val="22"/>
-                <w:szCs w:val="22"/>
-                <w:color w:val="000000"/>
-              </w:rPr>
-            </w:pPr>
-            <w:r>
-              <w:rPr>
-                <w:rFonts w:ascii="Arial" w:hAnsi="Arial" w:eastAsia="Arial" w:cs="Arial"/>
+              <w:pStyle w:val="Normal"/>
+              <w:jc w:val="left"/>
+              <w:pBdr>
+                <w:bottom w:val="none" w:sz="0" w:space="0" w:color="000000"/>
+                <w:top w:val="none" w:sz="0" w:space="0" w:color="000000"/>
+                <w:left w:val="none" w:sz="0" w:space="0" w:color="000000"/>
+                <w:right w:val="none" w:sz="0" w:space="0" w:color="000000"/>
+              </w:pBdr>
+              <w:spacing w:after="100" w:before="100" w:line="240"/>
+              <w:ind w:left="100" w:right="100" w:firstLine="0" w:firstLineChars="0"/>
+              <w:rPr>
+                <w:rFonts w:ascii="Helvetica" w:hAnsi="Helvetica" w:eastAsia="Helvetica" w:cs="Helvetica"/>
+                <w:i w:val="false"/>
+                <w:b w:val="false"/>
+                <w:u w:val="none"/>
+                <w:strike w:val="false"/>
+                <w:sz w:val="22"/>
+                <w:szCs w:val="22"/>
+                <w:color w:val="000000"/>
+              </w:rPr>
+            </w:pPr>
+            <w:r>
+              <w:rPr>
+                <w:rFonts w:ascii="Helvetica" w:hAnsi="Helvetica" w:eastAsia="Helvetica" w:cs="Helvetica"/>
                 <w:i w:val="false"/>
                 <w:b w:val="false"/>
                 <w:u w:val="none"/>
@@ -1256,29 +1274,30 @@
           </w:tcPr>
           <w:p>
             <w:pPr>
-              <w:jc w:val="left"/>
-              <w:pBdr>
-                <w:bottom w:val="none" w:sz="0" w:space="0" w:color="000000"/>
-                <w:top w:val="none" w:sz="0" w:space="0" w:color="000000"/>
-                <w:left w:val="none" w:sz="0" w:space="0" w:color="000000"/>
-                <w:right w:val="none" w:sz="0" w:space="0" w:color="000000"/>
-              </w:pBdr>
-              <w:spacing w:after="100" w:before="100" w:line="240"/>
-              <w:ind w:left="100" w:right="100" w:firstLine="0" w:firstLineChars="0"/>
-              <w:rPr>
-                <w:rFonts w:ascii="Arial" w:hAnsi="Arial" w:eastAsia="Arial" w:cs="Arial"/>
-                <w:i w:val="false"/>
-                <w:b w:val="false"/>
-                <w:u w:val="none"/>
-                <w:strike w:val="false"/>
-                <w:sz w:val="22"/>
-                <w:szCs w:val="22"/>
-                <w:color w:val="000000"/>
-              </w:rPr>
-            </w:pPr>
-            <w:r>
-              <w:rPr>
-                <w:rFonts w:ascii="Arial" w:hAnsi="Arial" w:eastAsia="Arial" w:cs="Arial"/>
+              <w:pStyle w:val="Normal"/>
+              <w:jc w:val="left"/>
+              <w:pBdr>
+                <w:bottom w:val="none" w:sz="0" w:space="0" w:color="000000"/>
+                <w:top w:val="none" w:sz="0" w:space="0" w:color="000000"/>
+                <w:left w:val="none" w:sz="0" w:space="0" w:color="000000"/>
+                <w:right w:val="none" w:sz="0" w:space="0" w:color="000000"/>
+              </w:pBdr>
+              <w:spacing w:after="100" w:before="100" w:line="240"/>
+              <w:ind w:left="100" w:right="100" w:firstLine="0" w:firstLineChars="0"/>
+              <w:rPr>
+                <w:rFonts w:ascii="Helvetica" w:hAnsi="Helvetica" w:eastAsia="Helvetica" w:cs="Helvetica"/>
+                <w:i w:val="false"/>
+                <w:b w:val="false"/>
+                <w:u w:val="none"/>
+                <w:strike w:val="false"/>
+                <w:sz w:val="22"/>
+                <w:szCs w:val="22"/>
+                <w:color w:val="000000"/>
+              </w:rPr>
+            </w:pPr>
+            <w:r>
+              <w:rPr>
+                <w:rFonts w:ascii="Helvetica" w:hAnsi="Helvetica" w:eastAsia="Helvetica" w:cs="Helvetica"/>
                 <w:i w:val="false"/>
                 <w:b w:val="false"/>
                 <w:u w:val="none"/>
@@ -1310,29 +1329,30 @@
           </w:tcPr>
           <w:p>
             <w:pPr>
-              <w:jc w:val="left"/>
-              <w:pBdr>
-                <w:bottom w:val="none" w:sz="0" w:space="0" w:color="000000"/>
-                <w:top w:val="none" w:sz="0" w:space="0" w:color="000000"/>
-                <w:left w:val="none" w:sz="0" w:space="0" w:color="000000"/>
-                <w:right w:val="none" w:sz="0" w:space="0" w:color="000000"/>
-              </w:pBdr>
-              <w:spacing w:after="100" w:before="100" w:line="240"/>
-              <w:ind w:left="100" w:right="100" w:firstLine="0" w:firstLineChars="0"/>
-              <w:rPr>
-                <w:rFonts w:ascii="Arial" w:hAnsi="Arial" w:eastAsia="Arial" w:cs="Arial"/>
-                <w:i w:val="false"/>
-                <w:b w:val="false"/>
-                <w:u w:val="none"/>
-                <w:strike w:val="false"/>
-                <w:sz w:val="22"/>
-                <w:szCs w:val="22"/>
-                <w:color w:val="000000"/>
-              </w:rPr>
-            </w:pPr>
-            <w:r>
-              <w:rPr>
-                <w:rFonts w:ascii="Arial" w:hAnsi="Arial" w:eastAsia="Arial" w:cs="Arial"/>
+              <w:pStyle w:val="Normal"/>
+              <w:jc w:val="left"/>
+              <w:pBdr>
+                <w:bottom w:val="none" w:sz="0" w:space="0" w:color="000000"/>
+                <w:top w:val="none" w:sz="0" w:space="0" w:color="000000"/>
+                <w:left w:val="none" w:sz="0" w:space="0" w:color="000000"/>
+                <w:right w:val="none" w:sz="0" w:space="0" w:color="000000"/>
+              </w:pBdr>
+              <w:spacing w:after="100" w:before="100" w:line="240"/>
+              <w:ind w:left="100" w:right="100" w:firstLine="0" w:firstLineChars="0"/>
+              <w:rPr>
+                <w:rFonts w:ascii="Helvetica" w:hAnsi="Helvetica" w:eastAsia="Helvetica" w:cs="Helvetica"/>
+                <w:i w:val="false"/>
+                <w:b w:val="false"/>
+                <w:u w:val="none"/>
+                <w:strike w:val="false"/>
+                <w:sz w:val="22"/>
+                <w:szCs w:val="22"/>
+                <w:color w:val="000000"/>
+              </w:rPr>
+            </w:pPr>
+            <w:r>
+              <w:rPr>
+                <w:rFonts w:ascii="Helvetica" w:hAnsi="Helvetica" w:eastAsia="Helvetica" w:cs="Helvetica"/>
                 <w:i w:val="false"/>
                 <w:b w:val="false"/>
                 <w:u w:val="none"/>
@@ -1364,29 +1384,30 @@
           </w:tcPr>
           <w:p>
             <w:pPr>
-              <w:jc w:val="left"/>
-              <w:pBdr>
-                <w:bottom w:val="none" w:sz="0" w:space="0" w:color="000000"/>
-                <w:top w:val="none" w:sz="0" w:space="0" w:color="000000"/>
-                <w:left w:val="none" w:sz="0" w:space="0" w:color="000000"/>
-                <w:right w:val="none" w:sz="0" w:space="0" w:color="000000"/>
-              </w:pBdr>
-              <w:spacing w:after="100" w:before="100" w:line="240"/>
-              <w:ind w:left="100" w:right="100" w:firstLine="0" w:firstLineChars="0"/>
-              <w:rPr>
-                <w:rFonts w:ascii="Arial" w:hAnsi="Arial" w:eastAsia="Arial" w:cs="Arial"/>
-                <w:i w:val="false"/>
-                <w:b w:val="false"/>
-                <w:u w:val="none"/>
-                <w:strike w:val="false"/>
-                <w:sz w:val="22"/>
-                <w:szCs w:val="22"/>
-                <w:color w:val="000000"/>
-              </w:rPr>
-            </w:pPr>
-            <w:r>
-              <w:rPr>
-                <w:rFonts w:ascii="Arial" w:hAnsi="Arial" w:eastAsia="Arial" w:cs="Arial"/>
+              <w:pStyle w:val="Normal"/>
+              <w:jc w:val="left"/>
+              <w:pBdr>
+                <w:bottom w:val="none" w:sz="0" w:space="0" w:color="000000"/>
+                <w:top w:val="none" w:sz="0" w:space="0" w:color="000000"/>
+                <w:left w:val="none" w:sz="0" w:space="0" w:color="000000"/>
+                <w:right w:val="none" w:sz="0" w:space="0" w:color="000000"/>
+              </w:pBdr>
+              <w:spacing w:after="100" w:before="100" w:line="240"/>
+              <w:ind w:left="100" w:right="100" w:firstLine="0" w:firstLineChars="0"/>
+              <w:rPr>
+                <w:rFonts w:ascii="Helvetica" w:hAnsi="Helvetica" w:eastAsia="Helvetica" w:cs="Helvetica"/>
+                <w:i w:val="false"/>
+                <w:b w:val="false"/>
+                <w:u w:val="none"/>
+                <w:strike w:val="false"/>
+                <w:sz w:val="22"/>
+                <w:szCs w:val="22"/>
+                <w:color w:val="000000"/>
+              </w:rPr>
+            </w:pPr>
+            <w:r>
+              <w:rPr>
+                <w:rFonts w:ascii="Helvetica" w:hAnsi="Helvetica" w:eastAsia="Helvetica" w:cs="Helvetica"/>
                 <w:i w:val="false"/>
                 <w:b w:val="false"/>
                 <w:u w:val="none"/>
@@ -1418,29 +1439,30 @@
           </w:tcPr>
           <w:p>
             <w:pPr>
-              <w:jc w:val="left"/>
-              <w:pBdr>
-                <w:bottom w:val="none" w:sz="0" w:space="0" w:color="000000"/>
-                <w:top w:val="none" w:sz="0" w:space="0" w:color="000000"/>
-                <w:left w:val="none" w:sz="0" w:space="0" w:color="000000"/>
-                <w:right w:val="none" w:sz="0" w:space="0" w:color="000000"/>
-              </w:pBdr>
-              <w:spacing w:after="100" w:before="100" w:line="240"/>
-              <w:ind w:left="100" w:right="100" w:firstLine="0" w:firstLineChars="0"/>
-              <w:rPr>
-                <w:rFonts w:ascii="Arial" w:hAnsi="Arial" w:eastAsia="Arial" w:cs="Arial"/>
-                <w:i w:val="false"/>
-                <w:b w:val="false"/>
-                <w:u w:val="none"/>
-                <w:strike w:val="false"/>
-                <w:sz w:val="22"/>
-                <w:szCs w:val="22"/>
-                <w:color w:val="000000"/>
-              </w:rPr>
-            </w:pPr>
-            <w:r>
-              <w:rPr>
-                <w:rFonts w:ascii="Arial" w:hAnsi="Arial" w:eastAsia="Arial" w:cs="Arial"/>
+              <w:pStyle w:val="Normal"/>
+              <w:jc w:val="left"/>
+              <w:pBdr>
+                <w:bottom w:val="none" w:sz="0" w:space="0" w:color="000000"/>
+                <w:top w:val="none" w:sz="0" w:space="0" w:color="000000"/>
+                <w:left w:val="none" w:sz="0" w:space="0" w:color="000000"/>
+                <w:right w:val="none" w:sz="0" w:space="0" w:color="000000"/>
+              </w:pBdr>
+              <w:spacing w:after="100" w:before="100" w:line="240"/>
+              <w:ind w:left="100" w:right="100" w:firstLine="0" w:firstLineChars="0"/>
+              <w:rPr>
+                <w:rFonts w:ascii="Helvetica" w:hAnsi="Helvetica" w:eastAsia="Helvetica" w:cs="Helvetica"/>
+                <w:i w:val="false"/>
+                <w:b w:val="false"/>
+                <w:u w:val="none"/>
+                <w:strike w:val="false"/>
+                <w:sz w:val="22"/>
+                <w:szCs w:val="22"/>
+                <w:color w:val="000000"/>
+              </w:rPr>
+            </w:pPr>
+            <w:r>
+              <w:rPr>
+                <w:rFonts w:ascii="Helvetica" w:hAnsi="Helvetica" w:eastAsia="Helvetica" w:cs="Helvetica"/>
                 <w:i w:val="false"/>
                 <w:b w:val="false"/>
                 <w:u w:val="none"/>
@@ -1472,29 +1494,30 @@
           </w:tcPr>
           <w:p>
             <w:pPr>
-              <w:jc w:val="left"/>
-              <w:pBdr>
-                <w:bottom w:val="none" w:sz="0" w:space="0" w:color="000000"/>
-                <w:top w:val="none" w:sz="0" w:space="0" w:color="000000"/>
-                <w:left w:val="none" w:sz="0" w:space="0" w:color="000000"/>
-                <w:right w:val="none" w:sz="0" w:space="0" w:color="000000"/>
-              </w:pBdr>
-              <w:spacing w:after="100" w:before="100" w:line="240"/>
-              <w:ind w:left="100" w:right="100" w:firstLine="0" w:firstLineChars="0"/>
-              <w:rPr>
-                <w:rFonts w:ascii="Arial" w:hAnsi="Arial" w:eastAsia="Arial" w:cs="Arial"/>
-                <w:i w:val="false"/>
-                <w:b w:val="false"/>
-                <w:u w:val="none"/>
-                <w:strike w:val="false"/>
-                <w:sz w:val="22"/>
-                <w:szCs w:val="22"/>
-                <w:color w:val="000000"/>
-              </w:rPr>
-            </w:pPr>
-            <w:r>
-              <w:rPr>
-                <w:rFonts w:ascii="Arial" w:hAnsi="Arial" w:eastAsia="Arial" w:cs="Arial"/>
+              <w:pStyle w:val="Normal"/>
+              <w:jc w:val="left"/>
+              <w:pBdr>
+                <w:bottom w:val="none" w:sz="0" w:space="0" w:color="000000"/>
+                <w:top w:val="none" w:sz="0" w:space="0" w:color="000000"/>
+                <w:left w:val="none" w:sz="0" w:space="0" w:color="000000"/>
+                <w:right w:val="none" w:sz="0" w:space="0" w:color="000000"/>
+              </w:pBdr>
+              <w:spacing w:after="100" w:before="100" w:line="240"/>
+              <w:ind w:left="100" w:right="100" w:firstLine="0" w:firstLineChars="0"/>
+              <w:rPr>
+                <w:rFonts w:ascii="Helvetica" w:hAnsi="Helvetica" w:eastAsia="Helvetica" w:cs="Helvetica"/>
+                <w:i w:val="false"/>
+                <w:b w:val="false"/>
+                <w:u w:val="none"/>
+                <w:strike w:val="false"/>
+                <w:sz w:val="22"/>
+                <w:szCs w:val="22"/>
+                <w:color w:val="000000"/>
+              </w:rPr>
+            </w:pPr>
+            <w:r>
+              <w:rPr>
+                <w:rFonts w:ascii="Helvetica" w:hAnsi="Helvetica" w:eastAsia="Helvetica" w:cs="Helvetica"/>
                 <w:i w:val="false"/>
                 <w:b w:val="false"/>
                 <w:u w:val="none"/>
@@ -1526,29 +1549,30 @@
           </w:tcPr>
           <w:p>
             <w:pPr>
-              <w:jc w:val="left"/>
-              <w:pBdr>
-                <w:bottom w:val="none" w:sz="0" w:space="0" w:color="000000"/>
-                <w:top w:val="none" w:sz="0" w:space="0" w:color="000000"/>
-                <w:left w:val="none" w:sz="0" w:space="0" w:color="000000"/>
-                <w:right w:val="none" w:sz="0" w:space="0" w:color="000000"/>
-              </w:pBdr>
-              <w:spacing w:after="100" w:before="100" w:line="240"/>
-              <w:ind w:left="100" w:right="100" w:firstLine="0" w:firstLineChars="0"/>
-              <w:rPr>
-                <w:rFonts w:ascii="Arial" w:hAnsi="Arial" w:eastAsia="Arial" w:cs="Arial"/>
-                <w:i w:val="false"/>
-                <w:b w:val="false"/>
-                <w:u w:val="none"/>
-                <w:strike w:val="false"/>
-                <w:sz w:val="22"/>
-                <w:szCs w:val="22"/>
-                <w:color w:val="000000"/>
-              </w:rPr>
-            </w:pPr>
-            <w:r>
-              <w:rPr>
-                <w:rFonts w:ascii="Arial" w:hAnsi="Arial" w:eastAsia="Arial" w:cs="Arial"/>
+              <w:pStyle w:val="Normal"/>
+              <w:jc w:val="left"/>
+              <w:pBdr>
+                <w:bottom w:val="none" w:sz="0" w:space="0" w:color="000000"/>
+                <w:top w:val="none" w:sz="0" w:space="0" w:color="000000"/>
+                <w:left w:val="none" w:sz="0" w:space="0" w:color="000000"/>
+                <w:right w:val="none" w:sz="0" w:space="0" w:color="000000"/>
+              </w:pBdr>
+              <w:spacing w:after="100" w:before="100" w:line="240"/>
+              <w:ind w:left="100" w:right="100" w:firstLine="0" w:firstLineChars="0"/>
+              <w:rPr>
+                <w:rFonts w:ascii="Helvetica" w:hAnsi="Helvetica" w:eastAsia="Helvetica" w:cs="Helvetica"/>
+                <w:i w:val="false"/>
+                <w:b w:val="false"/>
+                <w:u w:val="none"/>
+                <w:strike w:val="false"/>
+                <w:sz w:val="22"/>
+                <w:szCs w:val="22"/>
+                <w:color w:val="000000"/>
+              </w:rPr>
+            </w:pPr>
+            <w:r>
+              <w:rPr>
+                <w:rFonts w:ascii="Helvetica" w:hAnsi="Helvetica" w:eastAsia="Helvetica" w:cs="Helvetica"/>
                 <w:i w:val="false"/>
                 <w:b w:val="false"/>
                 <w:u w:val="none"/>
@@ -1564,9 +1588,8 @@
       </w:tr>
       <w:tr>
         <w:trPr>
-          <w:trHeight w:val="612" w:hRule="auto"/>
+          <w:trHeight w:val="608" w:hRule="auto"/>
         </w:trPr>
-        body4
         <w:tc>
           <w:tcPr>
             <w:tcBorders>
@@ -1586,29 +1609,30 @@
           </w:tcPr>
           <w:p>
             <w:pPr>
-              <w:jc w:val="left"/>
-              <w:pBdr>
-                <w:bottom w:val="none" w:sz="0" w:space="0" w:color="000000"/>
-                <w:top w:val="none" w:sz="0" w:space="0" w:color="000000"/>
-                <w:left w:val="none" w:sz="0" w:space="0" w:color="000000"/>
-                <w:right w:val="none" w:sz="0" w:space="0" w:color="000000"/>
-              </w:pBdr>
-              <w:spacing w:after="100" w:before="100" w:line="240"/>
-              <w:ind w:left="100" w:right="100" w:firstLine="0" w:firstLineChars="0"/>
-              <w:rPr>
-                <w:rFonts w:ascii="Arial" w:hAnsi="Arial" w:eastAsia="Arial" w:cs="Arial"/>
-                <w:i w:val="false"/>
-                <w:b w:val="false"/>
-                <w:u w:val="none"/>
-                <w:strike w:val="false"/>
-                <w:sz w:val="22"/>
-                <w:szCs w:val="22"/>
-                <w:color w:val="000000"/>
-              </w:rPr>
-            </w:pPr>
-            <w:r>
-              <w:rPr>
-                <w:rFonts w:ascii="Arial" w:hAnsi="Arial" w:eastAsia="Arial" w:cs="Arial"/>
+              <w:pStyle w:val="Normal"/>
+              <w:jc w:val="left"/>
+              <w:pBdr>
+                <w:bottom w:val="none" w:sz="0" w:space="0" w:color="000000"/>
+                <w:top w:val="none" w:sz="0" w:space="0" w:color="000000"/>
+                <w:left w:val="none" w:sz="0" w:space="0" w:color="000000"/>
+                <w:right w:val="none" w:sz="0" w:space="0" w:color="000000"/>
+              </w:pBdr>
+              <w:spacing w:after="100" w:before="100" w:line="240"/>
+              <w:ind w:left="100" w:right="100" w:firstLine="0" w:firstLineChars="0"/>
+              <w:rPr>
+                <w:rFonts w:ascii="Helvetica" w:hAnsi="Helvetica" w:eastAsia="Helvetica" w:cs="Helvetica"/>
+                <w:i w:val="false"/>
+                <w:b w:val="false"/>
+                <w:u w:val="none"/>
+                <w:strike w:val="false"/>
+                <w:sz w:val="22"/>
+                <w:szCs w:val="22"/>
+                <w:color w:val="000000"/>
+              </w:rPr>
+            </w:pPr>
+            <w:r>
+              <w:rPr>
+                <w:rFonts w:ascii="Helvetica" w:hAnsi="Helvetica" w:eastAsia="Helvetica" w:cs="Helvetica"/>
                 <w:i w:val="false"/>
                 <w:b w:val="false"/>
                 <w:u w:val="none"/>
@@ -1640,29 +1664,30 @@
           </w:tcPr>
           <w:p>
             <w:pPr>
-              <w:jc w:val="left"/>
-              <w:pBdr>
-                <w:bottom w:val="none" w:sz="0" w:space="0" w:color="000000"/>
-                <w:top w:val="none" w:sz="0" w:space="0" w:color="000000"/>
-                <w:left w:val="none" w:sz="0" w:space="0" w:color="000000"/>
-                <w:right w:val="none" w:sz="0" w:space="0" w:color="000000"/>
-              </w:pBdr>
-              <w:spacing w:after="100" w:before="100" w:line="240"/>
-              <w:ind w:left="100" w:right="100" w:firstLine="0" w:firstLineChars="0"/>
-              <w:rPr>
-                <w:rFonts w:ascii="Arial" w:hAnsi="Arial" w:eastAsia="Arial" w:cs="Arial"/>
-                <w:i w:val="false"/>
-                <w:b w:val="false"/>
-                <w:u w:val="none"/>
-                <w:strike w:val="false"/>
-                <w:sz w:val="22"/>
-                <w:szCs w:val="22"/>
-                <w:color w:val="000000"/>
-              </w:rPr>
-            </w:pPr>
-            <w:r>
-              <w:rPr>
-                <w:rFonts w:ascii="Arial" w:hAnsi="Arial" w:eastAsia="Arial" w:cs="Arial"/>
+              <w:pStyle w:val="Normal"/>
+              <w:jc w:val="left"/>
+              <w:pBdr>
+                <w:bottom w:val="none" w:sz="0" w:space="0" w:color="000000"/>
+                <w:top w:val="none" w:sz="0" w:space="0" w:color="000000"/>
+                <w:left w:val="none" w:sz="0" w:space="0" w:color="000000"/>
+                <w:right w:val="none" w:sz="0" w:space="0" w:color="000000"/>
+              </w:pBdr>
+              <w:spacing w:after="100" w:before="100" w:line="240"/>
+              <w:ind w:left="100" w:right="100" w:firstLine="0" w:firstLineChars="0"/>
+              <w:rPr>
+                <w:rFonts w:ascii="Helvetica" w:hAnsi="Helvetica" w:eastAsia="Helvetica" w:cs="Helvetica"/>
+                <w:i w:val="false"/>
+                <w:b w:val="false"/>
+                <w:u w:val="none"/>
+                <w:strike w:val="false"/>
+                <w:sz w:val="22"/>
+                <w:szCs w:val="22"/>
+                <w:color w:val="000000"/>
+              </w:rPr>
+            </w:pPr>
+            <w:r>
+              <w:rPr>
+                <w:rFonts w:ascii="Helvetica" w:hAnsi="Helvetica" w:eastAsia="Helvetica" w:cs="Helvetica"/>
                 <w:i w:val="false"/>
                 <w:b w:val="false"/>
                 <w:u w:val="none"/>
@@ -1694,29 +1719,30 @@
           </w:tcPr>
           <w:p>
             <w:pPr>
-              <w:jc w:val="left"/>
-              <w:pBdr>
-                <w:bottom w:val="none" w:sz="0" w:space="0" w:color="000000"/>
-                <w:top w:val="none" w:sz="0" w:space="0" w:color="000000"/>
-                <w:left w:val="none" w:sz="0" w:space="0" w:color="000000"/>
-                <w:right w:val="none" w:sz="0" w:space="0" w:color="000000"/>
-              </w:pBdr>
-              <w:spacing w:after="100" w:before="100" w:line="240"/>
-              <w:ind w:left="100" w:right="100" w:firstLine="0" w:firstLineChars="0"/>
-              <w:rPr>
-                <w:rFonts w:ascii="Arial" w:hAnsi="Arial" w:eastAsia="Arial" w:cs="Arial"/>
-                <w:i w:val="false"/>
-                <w:b w:val="false"/>
-                <w:u w:val="none"/>
-                <w:strike w:val="false"/>
-                <w:sz w:val="22"/>
-                <w:szCs w:val="22"/>
-                <w:color w:val="000000"/>
-              </w:rPr>
-            </w:pPr>
-            <w:r>
-              <w:rPr>
-                <w:rFonts w:ascii="Arial" w:hAnsi="Arial" w:eastAsia="Arial" w:cs="Arial"/>
+              <w:pStyle w:val="Normal"/>
+              <w:jc w:val="left"/>
+              <w:pBdr>
+                <w:bottom w:val="none" w:sz="0" w:space="0" w:color="000000"/>
+                <w:top w:val="none" w:sz="0" w:space="0" w:color="000000"/>
+                <w:left w:val="none" w:sz="0" w:space="0" w:color="000000"/>
+                <w:right w:val="none" w:sz="0" w:space="0" w:color="000000"/>
+              </w:pBdr>
+              <w:spacing w:after="100" w:before="100" w:line="240"/>
+              <w:ind w:left="100" w:right="100" w:firstLine="0" w:firstLineChars="0"/>
+              <w:rPr>
+                <w:rFonts w:ascii="Helvetica" w:hAnsi="Helvetica" w:eastAsia="Helvetica" w:cs="Helvetica"/>
+                <w:i w:val="false"/>
+                <w:b w:val="false"/>
+                <w:u w:val="none"/>
+                <w:strike w:val="false"/>
+                <w:sz w:val="22"/>
+                <w:szCs w:val="22"/>
+                <w:color w:val="000000"/>
+              </w:rPr>
+            </w:pPr>
+            <w:r>
+              <w:rPr>
+                <w:rFonts w:ascii="Helvetica" w:hAnsi="Helvetica" w:eastAsia="Helvetica" w:cs="Helvetica"/>
                 <w:i w:val="false"/>
                 <w:b w:val="false"/>
                 <w:u w:val="none"/>
@@ -1748,29 +1774,30 @@
           </w:tcPr>
           <w:p>
             <w:pPr>
-              <w:jc w:val="left"/>
-              <w:pBdr>
-                <w:bottom w:val="none" w:sz="0" w:space="0" w:color="000000"/>
-                <w:top w:val="none" w:sz="0" w:space="0" w:color="000000"/>
-                <w:left w:val="none" w:sz="0" w:space="0" w:color="000000"/>
-                <w:right w:val="none" w:sz="0" w:space="0" w:color="000000"/>
-              </w:pBdr>
-              <w:spacing w:after="100" w:before="100" w:line="240"/>
-              <w:ind w:left="100" w:right="100" w:firstLine="0" w:firstLineChars="0"/>
-              <w:rPr>
-                <w:rFonts w:ascii="Arial" w:hAnsi="Arial" w:eastAsia="Arial" w:cs="Arial"/>
-                <w:i w:val="false"/>
-                <w:b w:val="false"/>
-                <w:u w:val="none"/>
-                <w:strike w:val="false"/>
-                <w:sz w:val="22"/>
-                <w:szCs w:val="22"/>
-                <w:color w:val="000000"/>
-              </w:rPr>
-            </w:pPr>
-            <w:r>
-              <w:rPr>
-                <w:rFonts w:ascii="Arial" w:hAnsi="Arial" w:eastAsia="Arial" w:cs="Arial"/>
+              <w:pStyle w:val="Normal"/>
+              <w:jc w:val="left"/>
+              <w:pBdr>
+                <w:bottom w:val="none" w:sz="0" w:space="0" w:color="000000"/>
+                <w:top w:val="none" w:sz="0" w:space="0" w:color="000000"/>
+                <w:left w:val="none" w:sz="0" w:space="0" w:color="000000"/>
+                <w:right w:val="none" w:sz="0" w:space="0" w:color="000000"/>
+              </w:pBdr>
+              <w:spacing w:after="100" w:before="100" w:line="240"/>
+              <w:ind w:left="100" w:right="100" w:firstLine="0" w:firstLineChars="0"/>
+              <w:rPr>
+                <w:rFonts w:ascii="Helvetica" w:hAnsi="Helvetica" w:eastAsia="Helvetica" w:cs="Helvetica"/>
+                <w:i w:val="false"/>
+                <w:b w:val="false"/>
+                <w:u w:val="none"/>
+                <w:strike w:val="false"/>
+                <w:sz w:val="22"/>
+                <w:szCs w:val="22"/>
+                <w:color w:val="000000"/>
+              </w:rPr>
+            </w:pPr>
+            <w:r>
+              <w:rPr>
+                <w:rFonts w:ascii="Helvetica" w:hAnsi="Helvetica" w:eastAsia="Helvetica" w:cs="Helvetica"/>
                 <w:i w:val="false"/>
                 <w:b w:val="false"/>
                 <w:u w:val="none"/>
@@ -1802,29 +1829,30 @@
           </w:tcPr>
           <w:p>
             <w:pPr>
-              <w:jc w:val="left"/>
-              <w:pBdr>
-                <w:bottom w:val="none" w:sz="0" w:space="0" w:color="000000"/>
-                <w:top w:val="none" w:sz="0" w:space="0" w:color="000000"/>
-                <w:left w:val="none" w:sz="0" w:space="0" w:color="000000"/>
-                <w:right w:val="none" w:sz="0" w:space="0" w:color="000000"/>
-              </w:pBdr>
-              <w:spacing w:after="100" w:before="100" w:line="240"/>
-              <w:ind w:left="100" w:right="100" w:firstLine="0" w:firstLineChars="0"/>
-              <w:rPr>
-                <w:rFonts w:ascii="Arial" w:hAnsi="Arial" w:eastAsia="Arial" w:cs="Arial"/>
-                <w:i w:val="false"/>
-                <w:b w:val="false"/>
-                <w:u w:val="none"/>
-                <w:strike w:val="false"/>
-                <w:sz w:val="22"/>
-                <w:szCs w:val="22"/>
-                <w:color w:val="000000"/>
-              </w:rPr>
-            </w:pPr>
-            <w:r>
-              <w:rPr>
-                <w:rFonts w:ascii="Arial" w:hAnsi="Arial" w:eastAsia="Arial" w:cs="Arial"/>
+              <w:pStyle w:val="Normal"/>
+              <w:jc w:val="left"/>
+              <w:pBdr>
+                <w:bottom w:val="none" w:sz="0" w:space="0" w:color="000000"/>
+                <w:top w:val="none" w:sz="0" w:space="0" w:color="000000"/>
+                <w:left w:val="none" w:sz="0" w:space="0" w:color="000000"/>
+                <w:right w:val="none" w:sz="0" w:space="0" w:color="000000"/>
+              </w:pBdr>
+              <w:spacing w:after="100" w:before="100" w:line="240"/>
+              <w:ind w:left="100" w:right="100" w:firstLine="0" w:firstLineChars="0"/>
+              <w:rPr>
+                <w:rFonts w:ascii="Helvetica" w:hAnsi="Helvetica" w:eastAsia="Helvetica" w:cs="Helvetica"/>
+                <w:i w:val="false"/>
+                <w:b w:val="false"/>
+                <w:u w:val="none"/>
+                <w:strike w:val="false"/>
+                <w:sz w:val="22"/>
+                <w:szCs w:val="22"/>
+                <w:color w:val="000000"/>
+              </w:rPr>
+            </w:pPr>
+            <w:r>
+              <w:rPr>
+                <w:rFonts w:ascii="Helvetica" w:hAnsi="Helvetica" w:eastAsia="Helvetica" w:cs="Helvetica"/>
                 <w:i w:val="false"/>
                 <w:b w:val="false"/>
                 <w:u w:val="none"/>
@@ -1856,29 +1884,30 @@
           </w:tcPr>
           <w:p>
             <w:pPr>
-              <w:jc w:val="left"/>
-              <w:pBdr>
-                <w:bottom w:val="none" w:sz="0" w:space="0" w:color="000000"/>
-                <w:top w:val="none" w:sz="0" w:space="0" w:color="000000"/>
-                <w:left w:val="none" w:sz="0" w:space="0" w:color="000000"/>
-                <w:right w:val="none" w:sz="0" w:space="0" w:color="000000"/>
-              </w:pBdr>
-              <w:spacing w:after="100" w:before="100" w:line="240"/>
-              <w:ind w:left="100" w:right="100" w:firstLine="0" w:firstLineChars="0"/>
-              <w:rPr>
-                <w:rFonts w:ascii="Arial" w:hAnsi="Arial" w:eastAsia="Arial" w:cs="Arial"/>
-                <w:i w:val="false"/>
-                <w:b w:val="false"/>
-                <w:u w:val="none"/>
-                <w:strike w:val="false"/>
-                <w:sz w:val="22"/>
-                <w:szCs w:val="22"/>
-                <w:color w:val="000000"/>
-              </w:rPr>
-            </w:pPr>
-            <w:r>
-              <w:rPr>
-                <w:rFonts w:ascii="Arial" w:hAnsi="Arial" w:eastAsia="Arial" w:cs="Arial"/>
+              <w:pStyle w:val="Normal"/>
+              <w:jc w:val="left"/>
+              <w:pBdr>
+                <w:bottom w:val="none" w:sz="0" w:space="0" w:color="000000"/>
+                <w:top w:val="none" w:sz="0" w:space="0" w:color="000000"/>
+                <w:left w:val="none" w:sz="0" w:space="0" w:color="000000"/>
+                <w:right w:val="none" w:sz="0" w:space="0" w:color="000000"/>
+              </w:pBdr>
+              <w:spacing w:after="100" w:before="100" w:line="240"/>
+              <w:ind w:left="100" w:right="100" w:firstLine="0" w:firstLineChars="0"/>
+              <w:rPr>
+                <w:rFonts w:ascii="Helvetica" w:hAnsi="Helvetica" w:eastAsia="Helvetica" w:cs="Helvetica"/>
+                <w:i w:val="false"/>
+                <w:b w:val="false"/>
+                <w:u w:val="none"/>
+                <w:strike w:val="false"/>
+                <w:sz w:val="22"/>
+                <w:szCs w:val="22"/>
+                <w:color w:val="000000"/>
+              </w:rPr>
+            </w:pPr>
+            <w:r>
+              <w:rPr>
+                <w:rFonts w:ascii="Helvetica" w:hAnsi="Helvetica" w:eastAsia="Helvetica" w:cs="Helvetica"/>
                 <w:i w:val="false"/>
                 <w:b w:val="false"/>
                 <w:u w:val="none"/>
@@ -1910,29 +1939,30 @@
           </w:tcPr>
           <w:p>
             <w:pPr>
-              <w:jc w:val="left"/>
-              <w:pBdr>
-                <w:bottom w:val="none" w:sz="0" w:space="0" w:color="000000"/>
-                <w:top w:val="none" w:sz="0" w:space="0" w:color="000000"/>
-                <w:left w:val="none" w:sz="0" w:space="0" w:color="000000"/>
-                <w:right w:val="none" w:sz="0" w:space="0" w:color="000000"/>
-              </w:pBdr>
-              <w:spacing w:after="100" w:before="100" w:line="240"/>
-              <w:ind w:left="100" w:right="100" w:firstLine="0" w:firstLineChars="0"/>
-              <w:rPr>
-                <w:rFonts w:ascii="Arial" w:hAnsi="Arial" w:eastAsia="Arial" w:cs="Arial"/>
-                <w:i w:val="false"/>
-                <w:b w:val="false"/>
-                <w:u w:val="none"/>
-                <w:strike w:val="false"/>
-                <w:sz w:val="22"/>
-                <w:szCs w:val="22"/>
-                <w:color w:val="000000"/>
-              </w:rPr>
-            </w:pPr>
-            <w:r>
-              <w:rPr>
-                <w:rFonts w:ascii="Arial" w:hAnsi="Arial" w:eastAsia="Arial" w:cs="Arial"/>
+              <w:pStyle w:val="Normal"/>
+              <w:jc w:val="left"/>
+              <w:pBdr>
+                <w:bottom w:val="none" w:sz="0" w:space="0" w:color="000000"/>
+                <w:top w:val="none" w:sz="0" w:space="0" w:color="000000"/>
+                <w:left w:val="none" w:sz="0" w:space="0" w:color="000000"/>
+                <w:right w:val="none" w:sz="0" w:space="0" w:color="000000"/>
+              </w:pBdr>
+              <w:spacing w:after="100" w:before="100" w:line="240"/>
+              <w:ind w:left="100" w:right="100" w:firstLine="0" w:firstLineChars="0"/>
+              <w:rPr>
+                <w:rFonts w:ascii="Helvetica" w:hAnsi="Helvetica" w:eastAsia="Helvetica" w:cs="Helvetica"/>
+                <w:i w:val="false"/>
+                <w:b w:val="false"/>
+                <w:u w:val="none"/>
+                <w:strike w:val="false"/>
+                <w:sz w:val="22"/>
+                <w:szCs w:val="22"/>
+                <w:color w:val="000000"/>
+              </w:rPr>
+            </w:pPr>
+            <w:r>
+              <w:rPr>
+                <w:rFonts w:ascii="Helvetica" w:hAnsi="Helvetica" w:eastAsia="Helvetica" w:cs="Helvetica"/>
                 <w:i w:val="false"/>
                 <w:b w:val="false"/>
                 <w:u w:val="none"/>
@@ -1948,9 +1978,8 @@
       </w:tr>
       <w:tr>
         <w:trPr>
-          <w:trHeight w:val="615" w:hRule="auto"/>
+          <w:trHeight w:val="608" w:hRule="auto"/>
         </w:trPr>
-        body5
         <w:tc>
           <w:tcPr>
             <w:tcBorders>
@@ -1970,29 +1999,30 @@
           </w:tcPr>
           <w:p>
             <w:pPr>
-              <w:jc w:val="left"/>
-              <w:pBdr>
-                <w:bottom w:val="none" w:sz="0" w:space="0" w:color="000000"/>
-                <w:top w:val="none" w:sz="0" w:space="0" w:color="000000"/>
-                <w:left w:val="none" w:sz="0" w:space="0" w:color="000000"/>
-                <w:right w:val="none" w:sz="0" w:space="0" w:color="000000"/>
-              </w:pBdr>
-              <w:spacing w:after="100" w:before="100" w:line="240"/>
-              <w:ind w:left="100" w:right="100" w:firstLine="0" w:firstLineChars="0"/>
-              <w:rPr>
-                <w:rFonts w:ascii="Arial" w:hAnsi="Arial" w:eastAsia="Arial" w:cs="Arial"/>
-                <w:i w:val="false"/>
-                <w:b w:val="false"/>
-                <w:u w:val="none"/>
-                <w:strike w:val="false"/>
-                <w:sz w:val="22"/>
-                <w:szCs w:val="22"/>
-                <w:color w:val="000000"/>
-              </w:rPr>
-            </w:pPr>
-            <w:r>
-              <w:rPr>
-                <w:rFonts w:ascii="Arial" w:hAnsi="Arial" w:eastAsia="Arial" w:cs="Arial"/>
+              <w:pStyle w:val="Normal"/>
+              <w:jc w:val="left"/>
+              <w:pBdr>
+                <w:bottom w:val="none" w:sz="0" w:space="0" w:color="000000"/>
+                <w:top w:val="none" w:sz="0" w:space="0" w:color="000000"/>
+                <w:left w:val="none" w:sz="0" w:space="0" w:color="000000"/>
+                <w:right w:val="none" w:sz="0" w:space="0" w:color="000000"/>
+              </w:pBdr>
+              <w:spacing w:after="100" w:before="100" w:line="240"/>
+              <w:ind w:left="100" w:right="100" w:firstLine="0" w:firstLineChars="0"/>
+              <w:rPr>
+                <w:rFonts w:ascii="Helvetica" w:hAnsi="Helvetica" w:eastAsia="Helvetica" w:cs="Helvetica"/>
+                <w:i w:val="false"/>
+                <w:b w:val="false"/>
+                <w:u w:val="none"/>
+                <w:strike w:val="false"/>
+                <w:sz w:val="22"/>
+                <w:szCs w:val="22"/>
+                <w:color w:val="000000"/>
+              </w:rPr>
+            </w:pPr>
+            <w:r>
+              <w:rPr>
+                <w:rFonts w:ascii="Helvetica" w:hAnsi="Helvetica" w:eastAsia="Helvetica" w:cs="Helvetica"/>
                 <w:i w:val="false"/>
                 <w:b w:val="false"/>
                 <w:u w:val="none"/>
@@ -2024,29 +2054,30 @@
           </w:tcPr>
           <w:p>
             <w:pPr>
-              <w:jc w:val="left"/>
-              <w:pBdr>
-                <w:bottom w:val="none" w:sz="0" w:space="0" w:color="000000"/>
-                <w:top w:val="none" w:sz="0" w:space="0" w:color="000000"/>
-                <w:left w:val="none" w:sz="0" w:space="0" w:color="000000"/>
-                <w:right w:val="none" w:sz="0" w:space="0" w:color="000000"/>
-              </w:pBdr>
-              <w:spacing w:after="100" w:before="100" w:line="240"/>
-              <w:ind w:left="100" w:right="100" w:firstLine="0" w:firstLineChars="0"/>
-              <w:rPr>
-                <w:rFonts w:ascii="Arial" w:hAnsi="Arial" w:eastAsia="Arial" w:cs="Arial"/>
-                <w:i w:val="false"/>
-                <w:b w:val="false"/>
-                <w:u w:val="none"/>
-                <w:strike w:val="false"/>
-                <w:sz w:val="22"/>
-                <w:szCs w:val="22"/>
-                <w:color w:val="000000"/>
-              </w:rPr>
-            </w:pPr>
-            <w:r>
-              <w:rPr>
-                <w:rFonts w:ascii="Arial" w:hAnsi="Arial" w:eastAsia="Arial" w:cs="Arial"/>
+              <w:pStyle w:val="Normal"/>
+              <w:jc w:val="left"/>
+              <w:pBdr>
+                <w:bottom w:val="none" w:sz="0" w:space="0" w:color="000000"/>
+                <w:top w:val="none" w:sz="0" w:space="0" w:color="000000"/>
+                <w:left w:val="none" w:sz="0" w:space="0" w:color="000000"/>
+                <w:right w:val="none" w:sz="0" w:space="0" w:color="000000"/>
+              </w:pBdr>
+              <w:spacing w:after="100" w:before="100" w:line="240"/>
+              <w:ind w:left="100" w:right="100" w:firstLine="0" w:firstLineChars="0"/>
+              <w:rPr>
+                <w:rFonts w:ascii="Helvetica" w:hAnsi="Helvetica" w:eastAsia="Helvetica" w:cs="Helvetica"/>
+                <w:i w:val="false"/>
+                <w:b w:val="false"/>
+                <w:u w:val="none"/>
+                <w:strike w:val="false"/>
+                <w:sz w:val="22"/>
+                <w:szCs w:val="22"/>
+                <w:color w:val="000000"/>
+              </w:rPr>
+            </w:pPr>
+            <w:r>
+              <w:rPr>
+                <w:rFonts w:ascii="Helvetica" w:hAnsi="Helvetica" w:eastAsia="Helvetica" w:cs="Helvetica"/>
                 <w:i w:val="false"/>
                 <w:b w:val="false"/>
                 <w:u w:val="none"/>
@@ -2078,29 +2109,30 @@
           </w:tcPr>
           <w:p>
             <w:pPr>
-              <w:jc w:val="left"/>
-              <w:pBdr>
-                <w:bottom w:val="none" w:sz="0" w:space="0" w:color="000000"/>
-                <w:top w:val="none" w:sz="0" w:space="0" w:color="000000"/>
-                <w:left w:val="none" w:sz="0" w:space="0" w:color="000000"/>
-                <w:right w:val="none" w:sz="0" w:space="0" w:color="000000"/>
-              </w:pBdr>
-              <w:spacing w:after="100" w:before="100" w:line="240"/>
-              <w:ind w:left="100" w:right="100" w:firstLine="0" w:firstLineChars="0"/>
-              <w:rPr>
-                <w:rFonts w:ascii="Arial" w:hAnsi="Arial" w:eastAsia="Arial" w:cs="Arial"/>
-                <w:i w:val="false"/>
-                <w:b w:val="false"/>
-                <w:u w:val="none"/>
-                <w:strike w:val="false"/>
-                <w:sz w:val="22"/>
-                <w:szCs w:val="22"/>
-                <w:color w:val="000000"/>
-              </w:rPr>
-            </w:pPr>
-            <w:r>
-              <w:rPr>
-                <w:rFonts w:ascii="Arial" w:hAnsi="Arial" w:eastAsia="Arial" w:cs="Arial"/>
+              <w:pStyle w:val="Normal"/>
+              <w:jc w:val="left"/>
+              <w:pBdr>
+                <w:bottom w:val="none" w:sz="0" w:space="0" w:color="000000"/>
+                <w:top w:val="none" w:sz="0" w:space="0" w:color="000000"/>
+                <w:left w:val="none" w:sz="0" w:space="0" w:color="000000"/>
+                <w:right w:val="none" w:sz="0" w:space="0" w:color="000000"/>
+              </w:pBdr>
+              <w:spacing w:after="100" w:before="100" w:line="240"/>
+              <w:ind w:left="100" w:right="100" w:firstLine="0" w:firstLineChars="0"/>
+              <w:rPr>
+                <w:rFonts w:ascii="Helvetica" w:hAnsi="Helvetica" w:eastAsia="Helvetica" w:cs="Helvetica"/>
+                <w:i w:val="false"/>
+                <w:b w:val="false"/>
+                <w:u w:val="none"/>
+                <w:strike w:val="false"/>
+                <w:sz w:val="22"/>
+                <w:szCs w:val="22"/>
+                <w:color w:val="000000"/>
+              </w:rPr>
+            </w:pPr>
+            <w:r>
+              <w:rPr>
+                <w:rFonts w:ascii="Helvetica" w:hAnsi="Helvetica" w:eastAsia="Helvetica" w:cs="Helvetica"/>
                 <w:i w:val="false"/>
                 <w:b w:val="false"/>
                 <w:u w:val="none"/>
@@ -2132,29 +2164,30 @@
           </w:tcPr>
           <w:p>
             <w:pPr>
-              <w:jc w:val="left"/>
-              <w:pBdr>
-                <w:bottom w:val="none" w:sz="0" w:space="0" w:color="000000"/>
-                <w:top w:val="none" w:sz="0" w:space="0" w:color="000000"/>
-                <w:left w:val="none" w:sz="0" w:space="0" w:color="000000"/>
-                <w:right w:val="none" w:sz="0" w:space="0" w:color="000000"/>
-              </w:pBdr>
-              <w:spacing w:after="100" w:before="100" w:line="240"/>
-              <w:ind w:left="100" w:right="100" w:firstLine="0" w:firstLineChars="0"/>
-              <w:rPr>
-                <w:rFonts w:ascii="Arial" w:hAnsi="Arial" w:eastAsia="Arial" w:cs="Arial"/>
-                <w:i w:val="false"/>
-                <w:b w:val="false"/>
-                <w:u w:val="none"/>
-                <w:strike w:val="false"/>
-                <w:sz w:val="22"/>
-                <w:szCs w:val="22"/>
-                <w:color w:val="000000"/>
-              </w:rPr>
-            </w:pPr>
-            <w:r>
-              <w:rPr>
-                <w:rFonts w:ascii="Arial" w:hAnsi="Arial" w:eastAsia="Arial" w:cs="Arial"/>
+              <w:pStyle w:val="Normal"/>
+              <w:jc w:val="left"/>
+              <w:pBdr>
+                <w:bottom w:val="none" w:sz="0" w:space="0" w:color="000000"/>
+                <w:top w:val="none" w:sz="0" w:space="0" w:color="000000"/>
+                <w:left w:val="none" w:sz="0" w:space="0" w:color="000000"/>
+                <w:right w:val="none" w:sz="0" w:space="0" w:color="000000"/>
+              </w:pBdr>
+              <w:spacing w:after="100" w:before="100" w:line="240"/>
+              <w:ind w:left="100" w:right="100" w:firstLine="0" w:firstLineChars="0"/>
+              <w:rPr>
+                <w:rFonts w:ascii="Helvetica" w:hAnsi="Helvetica" w:eastAsia="Helvetica" w:cs="Helvetica"/>
+                <w:i w:val="false"/>
+                <w:b w:val="false"/>
+                <w:u w:val="none"/>
+                <w:strike w:val="false"/>
+                <w:sz w:val="22"/>
+                <w:szCs w:val="22"/>
+                <w:color w:val="000000"/>
+              </w:rPr>
+            </w:pPr>
+            <w:r>
+              <w:rPr>
+                <w:rFonts w:ascii="Helvetica" w:hAnsi="Helvetica" w:eastAsia="Helvetica" w:cs="Helvetica"/>
                 <w:i w:val="false"/>
                 <w:b w:val="false"/>
                 <w:u w:val="none"/>
@@ -2186,29 +2219,30 @@
           </w:tcPr>
           <w:p>
             <w:pPr>
-              <w:jc w:val="left"/>
-              <w:pBdr>
-                <w:bottom w:val="none" w:sz="0" w:space="0" w:color="000000"/>
-                <w:top w:val="none" w:sz="0" w:space="0" w:color="000000"/>
-                <w:left w:val="none" w:sz="0" w:space="0" w:color="000000"/>
-                <w:right w:val="none" w:sz="0" w:space="0" w:color="000000"/>
-              </w:pBdr>
-              <w:spacing w:after="100" w:before="100" w:line="240"/>
-              <w:ind w:left="100" w:right="100" w:firstLine="0" w:firstLineChars="0"/>
-              <w:rPr>
-                <w:rFonts w:ascii="Arial" w:hAnsi="Arial" w:eastAsia="Arial" w:cs="Arial"/>
-                <w:i w:val="false"/>
-                <w:b w:val="false"/>
-                <w:u w:val="none"/>
-                <w:strike w:val="false"/>
-                <w:sz w:val="22"/>
-                <w:szCs w:val="22"/>
-                <w:color w:val="000000"/>
-              </w:rPr>
-            </w:pPr>
-            <w:r>
-              <w:rPr>
-                <w:rFonts w:ascii="Arial" w:hAnsi="Arial" w:eastAsia="Arial" w:cs="Arial"/>
+              <w:pStyle w:val="Normal"/>
+              <w:jc w:val="left"/>
+              <w:pBdr>
+                <w:bottom w:val="none" w:sz="0" w:space="0" w:color="000000"/>
+                <w:top w:val="none" w:sz="0" w:space="0" w:color="000000"/>
+                <w:left w:val="none" w:sz="0" w:space="0" w:color="000000"/>
+                <w:right w:val="none" w:sz="0" w:space="0" w:color="000000"/>
+              </w:pBdr>
+              <w:spacing w:after="100" w:before="100" w:line="240"/>
+              <w:ind w:left="100" w:right="100" w:firstLine="0" w:firstLineChars="0"/>
+              <w:rPr>
+                <w:rFonts w:ascii="Helvetica" w:hAnsi="Helvetica" w:eastAsia="Helvetica" w:cs="Helvetica"/>
+                <w:i w:val="false"/>
+                <w:b w:val="false"/>
+                <w:u w:val="none"/>
+                <w:strike w:val="false"/>
+                <w:sz w:val="22"/>
+                <w:szCs w:val="22"/>
+                <w:color w:val="000000"/>
+              </w:rPr>
+            </w:pPr>
+            <w:r>
+              <w:rPr>
+                <w:rFonts w:ascii="Helvetica" w:hAnsi="Helvetica" w:eastAsia="Helvetica" w:cs="Helvetica"/>
                 <w:i w:val="false"/>
                 <w:b w:val="false"/>
                 <w:u w:val="none"/>
@@ -2240,29 +2274,30 @@
           </w:tcPr>
           <w:p>
             <w:pPr>
-              <w:jc w:val="left"/>
-              <w:pBdr>
-                <w:bottom w:val="none" w:sz="0" w:space="0" w:color="000000"/>
-                <w:top w:val="none" w:sz="0" w:space="0" w:color="000000"/>
-                <w:left w:val="none" w:sz="0" w:space="0" w:color="000000"/>
-                <w:right w:val="none" w:sz="0" w:space="0" w:color="000000"/>
-              </w:pBdr>
-              <w:spacing w:after="100" w:before="100" w:line="240"/>
-              <w:ind w:left="100" w:right="100" w:firstLine="0" w:firstLineChars="0"/>
-              <w:rPr>
-                <w:rFonts w:ascii="Arial" w:hAnsi="Arial" w:eastAsia="Arial" w:cs="Arial"/>
-                <w:i w:val="false"/>
-                <w:b w:val="false"/>
-                <w:u w:val="none"/>
-                <w:strike w:val="false"/>
-                <w:sz w:val="22"/>
-                <w:szCs w:val="22"/>
-                <w:color w:val="000000"/>
-              </w:rPr>
-            </w:pPr>
-            <w:r>
-              <w:rPr>
-                <w:rFonts w:ascii="Arial" w:hAnsi="Arial" w:eastAsia="Arial" w:cs="Arial"/>
+              <w:pStyle w:val="Normal"/>
+              <w:jc w:val="left"/>
+              <w:pBdr>
+                <w:bottom w:val="none" w:sz="0" w:space="0" w:color="000000"/>
+                <w:top w:val="none" w:sz="0" w:space="0" w:color="000000"/>
+                <w:left w:val="none" w:sz="0" w:space="0" w:color="000000"/>
+                <w:right w:val="none" w:sz="0" w:space="0" w:color="000000"/>
+              </w:pBdr>
+              <w:spacing w:after="100" w:before="100" w:line="240"/>
+              <w:ind w:left="100" w:right="100" w:firstLine="0" w:firstLineChars="0"/>
+              <w:rPr>
+                <w:rFonts w:ascii="Helvetica" w:hAnsi="Helvetica" w:eastAsia="Helvetica" w:cs="Helvetica"/>
+                <w:i w:val="false"/>
+                <w:b w:val="false"/>
+                <w:u w:val="none"/>
+                <w:strike w:val="false"/>
+                <w:sz w:val="22"/>
+                <w:szCs w:val="22"/>
+                <w:color w:val="000000"/>
+              </w:rPr>
+            </w:pPr>
+            <w:r>
+              <w:rPr>
+                <w:rFonts w:ascii="Helvetica" w:hAnsi="Helvetica" w:eastAsia="Helvetica" w:cs="Helvetica"/>
                 <w:i w:val="false"/>
                 <w:b w:val="false"/>
                 <w:u w:val="none"/>
@@ -2294,29 +2329,30 @@
           </w:tcPr>
           <w:p>
             <w:pPr>
-              <w:jc w:val="left"/>
-              <w:pBdr>
-                <w:bottom w:val="none" w:sz="0" w:space="0" w:color="000000"/>
-                <w:top w:val="none" w:sz="0" w:space="0" w:color="000000"/>
-                <w:left w:val="none" w:sz="0" w:space="0" w:color="000000"/>
-                <w:right w:val="none" w:sz="0" w:space="0" w:color="000000"/>
-              </w:pBdr>
-              <w:spacing w:after="100" w:before="100" w:line="240"/>
-              <w:ind w:left="100" w:right="100" w:firstLine="0" w:firstLineChars="0"/>
-              <w:rPr>
-                <w:rFonts w:ascii="Arial" w:hAnsi="Arial" w:eastAsia="Arial" w:cs="Arial"/>
-                <w:i w:val="false"/>
-                <w:b w:val="false"/>
-                <w:u w:val="none"/>
-                <w:strike w:val="false"/>
-                <w:sz w:val="22"/>
-                <w:szCs w:val="22"/>
-                <w:color w:val="000000"/>
-              </w:rPr>
-            </w:pPr>
-            <w:r>
-              <w:rPr>
-                <w:rFonts w:ascii="Arial" w:hAnsi="Arial" w:eastAsia="Arial" w:cs="Arial"/>
+              <w:pStyle w:val="Normal"/>
+              <w:jc w:val="left"/>
+              <w:pBdr>
+                <w:bottom w:val="none" w:sz="0" w:space="0" w:color="000000"/>
+                <w:top w:val="none" w:sz="0" w:space="0" w:color="000000"/>
+                <w:left w:val="none" w:sz="0" w:space="0" w:color="000000"/>
+                <w:right w:val="none" w:sz="0" w:space="0" w:color="000000"/>
+              </w:pBdr>
+              <w:spacing w:after="100" w:before="100" w:line="240"/>
+              <w:ind w:left="100" w:right="100" w:firstLine="0" w:firstLineChars="0"/>
+              <w:rPr>
+                <w:rFonts w:ascii="Helvetica" w:hAnsi="Helvetica" w:eastAsia="Helvetica" w:cs="Helvetica"/>
+                <w:i w:val="false"/>
+                <w:b w:val="false"/>
+                <w:u w:val="none"/>
+                <w:strike w:val="false"/>
+                <w:sz w:val="22"/>
+                <w:szCs w:val="22"/>
+                <w:color w:val="000000"/>
+              </w:rPr>
+            </w:pPr>
+            <w:r>
+              <w:rPr>
+                <w:rFonts w:ascii="Helvetica" w:hAnsi="Helvetica" w:eastAsia="Helvetica" w:cs="Helvetica"/>
                 <w:i w:val="false"/>
                 <w:b w:val="false"/>
                 <w:u w:val="none"/>
@@ -2332,9 +2368,8 @@
       </w:tr>
       <w:tr>
         <w:trPr>
-          <w:trHeight w:val="617" w:hRule="auto"/>
+          <w:trHeight w:val="623" w:hRule="auto"/>
         </w:trPr>
-        body6
         <w:tc>
           <w:tcPr>
             <w:tcBorders>
@@ -2354,29 +2389,30 @@
           </w:tcPr>
           <w:p>
             <w:pPr>
-              <w:jc w:val="left"/>
-              <w:pBdr>
-                <w:bottom w:val="none" w:sz="0" w:space="0" w:color="000000"/>
-                <w:top w:val="none" w:sz="0" w:space="0" w:color="000000"/>
-                <w:left w:val="none" w:sz="0" w:space="0" w:color="000000"/>
-                <w:right w:val="none" w:sz="0" w:space="0" w:color="000000"/>
-              </w:pBdr>
-              <w:spacing w:after="100" w:before="100" w:line="240"/>
-              <w:ind w:left="100" w:right="100" w:firstLine="0" w:firstLineChars="0"/>
-              <w:rPr>
-                <w:rFonts w:ascii="Arial" w:hAnsi="Arial" w:eastAsia="Arial" w:cs="Arial"/>
-                <w:i w:val="false"/>
-                <w:b w:val="false"/>
-                <w:u w:val="none"/>
-                <w:strike w:val="false"/>
-                <w:sz w:val="22"/>
-                <w:szCs w:val="22"/>
-                <w:color w:val="000000"/>
-              </w:rPr>
-            </w:pPr>
-            <w:r>
-              <w:rPr>
-                <w:rFonts w:ascii="Arial" w:hAnsi="Arial" w:eastAsia="Arial" w:cs="Arial"/>
+              <w:pStyle w:val="Normal"/>
+              <w:jc w:val="left"/>
+              <w:pBdr>
+                <w:bottom w:val="none" w:sz="0" w:space="0" w:color="000000"/>
+                <w:top w:val="none" w:sz="0" w:space="0" w:color="000000"/>
+                <w:left w:val="none" w:sz="0" w:space="0" w:color="000000"/>
+                <w:right w:val="none" w:sz="0" w:space="0" w:color="000000"/>
+              </w:pBdr>
+              <w:spacing w:after="100" w:before="100" w:line="240"/>
+              <w:ind w:left="100" w:right="100" w:firstLine="0" w:firstLineChars="0"/>
+              <w:rPr>
+                <w:rFonts w:ascii="Helvetica" w:hAnsi="Helvetica" w:eastAsia="Helvetica" w:cs="Helvetica"/>
+                <w:i w:val="false"/>
+                <w:b w:val="false"/>
+                <w:u w:val="none"/>
+                <w:strike w:val="false"/>
+                <w:sz w:val="22"/>
+                <w:szCs w:val="22"/>
+                <w:color w:val="000000"/>
+              </w:rPr>
+            </w:pPr>
+            <w:r>
+              <w:rPr>
+                <w:rFonts w:ascii="Helvetica" w:hAnsi="Helvetica" w:eastAsia="Helvetica" w:cs="Helvetica"/>
                 <w:i w:val="false"/>
                 <w:b w:val="false"/>
                 <w:u w:val="none"/>
@@ -2408,29 +2444,30 @@
           </w:tcPr>
           <w:p>
             <w:pPr>
-              <w:jc w:val="left"/>
-              <w:pBdr>
-                <w:bottom w:val="none" w:sz="0" w:space="0" w:color="000000"/>
-                <w:top w:val="none" w:sz="0" w:space="0" w:color="000000"/>
-                <w:left w:val="none" w:sz="0" w:space="0" w:color="000000"/>
-                <w:right w:val="none" w:sz="0" w:space="0" w:color="000000"/>
-              </w:pBdr>
-              <w:spacing w:after="100" w:before="100" w:line="240"/>
-              <w:ind w:left="100" w:right="100" w:firstLine="0" w:firstLineChars="0"/>
-              <w:rPr>
-                <w:rFonts w:ascii="Arial" w:hAnsi="Arial" w:eastAsia="Arial" w:cs="Arial"/>
-                <w:i w:val="false"/>
-                <w:b w:val="false"/>
-                <w:u w:val="none"/>
-                <w:strike w:val="false"/>
-                <w:sz w:val="22"/>
-                <w:szCs w:val="22"/>
-                <w:color w:val="000000"/>
-              </w:rPr>
-            </w:pPr>
-            <w:r>
-              <w:rPr>
-                <w:rFonts w:ascii="Arial" w:hAnsi="Arial" w:eastAsia="Arial" w:cs="Arial"/>
+              <w:pStyle w:val="Normal"/>
+              <w:jc w:val="left"/>
+              <w:pBdr>
+                <w:bottom w:val="none" w:sz="0" w:space="0" w:color="000000"/>
+                <w:top w:val="none" w:sz="0" w:space="0" w:color="000000"/>
+                <w:left w:val="none" w:sz="0" w:space="0" w:color="000000"/>
+                <w:right w:val="none" w:sz="0" w:space="0" w:color="000000"/>
+              </w:pBdr>
+              <w:spacing w:after="100" w:before="100" w:line="240"/>
+              <w:ind w:left="100" w:right="100" w:firstLine="0" w:firstLineChars="0"/>
+              <w:rPr>
+                <w:rFonts w:ascii="Helvetica" w:hAnsi="Helvetica" w:eastAsia="Helvetica" w:cs="Helvetica"/>
+                <w:i w:val="false"/>
+                <w:b w:val="false"/>
+                <w:u w:val="none"/>
+                <w:strike w:val="false"/>
+                <w:sz w:val="22"/>
+                <w:szCs w:val="22"/>
+                <w:color w:val="000000"/>
+              </w:rPr>
+            </w:pPr>
+            <w:r>
+              <w:rPr>
+                <w:rFonts w:ascii="Helvetica" w:hAnsi="Helvetica" w:eastAsia="Helvetica" w:cs="Helvetica"/>
                 <w:i w:val="false"/>
                 <w:b w:val="false"/>
                 <w:u w:val="none"/>
@@ -2462,29 +2499,30 @@
           </w:tcPr>
           <w:p>
             <w:pPr>
-              <w:jc w:val="left"/>
-              <w:pBdr>
-                <w:bottom w:val="none" w:sz="0" w:space="0" w:color="000000"/>
-                <w:top w:val="none" w:sz="0" w:space="0" w:color="000000"/>
-                <w:left w:val="none" w:sz="0" w:space="0" w:color="000000"/>
-                <w:right w:val="none" w:sz="0" w:space="0" w:color="000000"/>
-              </w:pBdr>
-              <w:spacing w:after="100" w:before="100" w:line="240"/>
-              <w:ind w:left="100" w:right="100" w:firstLine="0" w:firstLineChars="0"/>
-              <w:rPr>
-                <w:rFonts w:ascii="Arial" w:hAnsi="Arial" w:eastAsia="Arial" w:cs="Arial"/>
-                <w:i w:val="false"/>
-                <w:b w:val="false"/>
-                <w:u w:val="none"/>
-                <w:strike w:val="false"/>
-                <w:sz w:val="22"/>
-                <w:szCs w:val="22"/>
-                <w:color w:val="000000"/>
-              </w:rPr>
-            </w:pPr>
-            <w:r>
-              <w:rPr>
-                <w:rFonts w:ascii="Arial" w:hAnsi="Arial" w:eastAsia="Arial" w:cs="Arial"/>
+              <w:pStyle w:val="Normal"/>
+              <w:jc w:val="left"/>
+              <w:pBdr>
+                <w:bottom w:val="none" w:sz="0" w:space="0" w:color="000000"/>
+                <w:top w:val="none" w:sz="0" w:space="0" w:color="000000"/>
+                <w:left w:val="none" w:sz="0" w:space="0" w:color="000000"/>
+                <w:right w:val="none" w:sz="0" w:space="0" w:color="000000"/>
+              </w:pBdr>
+              <w:spacing w:after="100" w:before="100" w:line="240"/>
+              <w:ind w:left="100" w:right="100" w:firstLine="0" w:firstLineChars="0"/>
+              <w:rPr>
+                <w:rFonts w:ascii="Helvetica" w:hAnsi="Helvetica" w:eastAsia="Helvetica" w:cs="Helvetica"/>
+                <w:i w:val="false"/>
+                <w:b w:val="false"/>
+                <w:u w:val="none"/>
+                <w:strike w:val="false"/>
+                <w:sz w:val="22"/>
+                <w:szCs w:val="22"/>
+                <w:color w:val="000000"/>
+              </w:rPr>
+            </w:pPr>
+            <w:r>
+              <w:rPr>
+                <w:rFonts w:ascii="Helvetica" w:hAnsi="Helvetica" w:eastAsia="Helvetica" w:cs="Helvetica"/>
                 <w:i w:val="false"/>
                 <w:b w:val="false"/>
                 <w:u w:val="none"/>
@@ -2516,29 +2554,30 @@
           </w:tcPr>
           <w:p>
             <w:pPr>
-              <w:jc w:val="left"/>
-              <w:pBdr>
-                <w:bottom w:val="none" w:sz="0" w:space="0" w:color="000000"/>
-                <w:top w:val="none" w:sz="0" w:space="0" w:color="000000"/>
-                <w:left w:val="none" w:sz="0" w:space="0" w:color="000000"/>
-                <w:right w:val="none" w:sz="0" w:space="0" w:color="000000"/>
-              </w:pBdr>
-              <w:spacing w:after="100" w:before="100" w:line="240"/>
-              <w:ind w:left="100" w:right="100" w:firstLine="0" w:firstLineChars="0"/>
-              <w:rPr>
-                <w:rFonts w:ascii="Arial" w:hAnsi="Arial" w:eastAsia="Arial" w:cs="Arial"/>
-                <w:i w:val="false"/>
-                <w:b w:val="false"/>
-                <w:u w:val="none"/>
-                <w:strike w:val="false"/>
-                <w:sz w:val="22"/>
-                <w:szCs w:val="22"/>
-                <w:color w:val="000000"/>
-              </w:rPr>
-            </w:pPr>
-            <w:r>
-              <w:rPr>
-                <w:rFonts w:ascii="Arial" w:hAnsi="Arial" w:eastAsia="Arial" w:cs="Arial"/>
+              <w:pStyle w:val="Normal"/>
+              <w:jc w:val="left"/>
+              <w:pBdr>
+                <w:bottom w:val="none" w:sz="0" w:space="0" w:color="000000"/>
+                <w:top w:val="none" w:sz="0" w:space="0" w:color="000000"/>
+                <w:left w:val="none" w:sz="0" w:space="0" w:color="000000"/>
+                <w:right w:val="none" w:sz="0" w:space="0" w:color="000000"/>
+              </w:pBdr>
+              <w:spacing w:after="100" w:before="100" w:line="240"/>
+              <w:ind w:left="100" w:right="100" w:firstLine="0" w:firstLineChars="0"/>
+              <w:rPr>
+                <w:rFonts w:ascii="Helvetica" w:hAnsi="Helvetica" w:eastAsia="Helvetica" w:cs="Helvetica"/>
+                <w:i w:val="false"/>
+                <w:b w:val="false"/>
+                <w:u w:val="none"/>
+                <w:strike w:val="false"/>
+                <w:sz w:val="22"/>
+                <w:szCs w:val="22"/>
+                <w:color w:val="000000"/>
+              </w:rPr>
+            </w:pPr>
+            <w:r>
+              <w:rPr>
+                <w:rFonts w:ascii="Helvetica" w:hAnsi="Helvetica" w:eastAsia="Helvetica" w:cs="Helvetica"/>
                 <w:i w:val="false"/>
                 <w:b w:val="false"/>
                 <w:u w:val="none"/>
@@ -2570,29 +2609,30 @@
           </w:tcPr>
           <w:p>
             <w:pPr>
-              <w:jc w:val="left"/>
-              <w:pBdr>
-                <w:bottom w:val="none" w:sz="0" w:space="0" w:color="000000"/>
-                <w:top w:val="none" w:sz="0" w:space="0" w:color="000000"/>
-                <w:left w:val="none" w:sz="0" w:space="0" w:color="000000"/>
-                <w:right w:val="none" w:sz="0" w:space="0" w:color="000000"/>
-              </w:pBdr>
-              <w:spacing w:after="100" w:before="100" w:line="240"/>
-              <w:ind w:left="100" w:right="100" w:firstLine="0" w:firstLineChars="0"/>
-              <w:rPr>
-                <w:rFonts w:ascii="Arial" w:hAnsi="Arial" w:eastAsia="Arial" w:cs="Arial"/>
-                <w:i w:val="false"/>
-                <w:b w:val="false"/>
-                <w:u w:val="none"/>
-                <w:strike w:val="false"/>
-                <w:sz w:val="22"/>
-                <w:szCs w:val="22"/>
-                <w:color w:val="000000"/>
-              </w:rPr>
-            </w:pPr>
-            <w:r>
-              <w:rPr>
-                <w:rFonts w:ascii="Arial" w:hAnsi="Arial" w:eastAsia="Arial" w:cs="Arial"/>
+              <w:pStyle w:val="Normal"/>
+              <w:jc w:val="left"/>
+              <w:pBdr>
+                <w:bottom w:val="none" w:sz="0" w:space="0" w:color="000000"/>
+                <w:top w:val="none" w:sz="0" w:space="0" w:color="000000"/>
+                <w:left w:val="none" w:sz="0" w:space="0" w:color="000000"/>
+                <w:right w:val="none" w:sz="0" w:space="0" w:color="000000"/>
+              </w:pBdr>
+              <w:spacing w:after="100" w:before="100" w:line="240"/>
+              <w:ind w:left="100" w:right="100" w:firstLine="0" w:firstLineChars="0"/>
+              <w:rPr>
+                <w:rFonts w:ascii="Helvetica" w:hAnsi="Helvetica" w:eastAsia="Helvetica" w:cs="Helvetica"/>
+                <w:i w:val="false"/>
+                <w:b w:val="false"/>
+                <w:u w:val="none"/>
+                <w:strike w:val="false"/>
+                <w:sz w:val="22"/>
+                <w:szCs w:val="22"/>
+                <w:color w:val="000000"/>
+              </w:rPr>
+            </w:pPr>
+            <w:r>
+              <w:rPr>
+                <w:rFonts w:ascii="Helvetica" w:hAnsi="Helvetica" w:eastAsia="Helvetica" w:cs="Helvetica"/>
                 <w:i w:val="false"/>
                 <w:b w:val="false"/>
                 <w:u w:val="none"/>
@@ -2624,29 +2664,30 @@
           </w:tcPr>
           <w:p>
             <w:pPr>
-              <w:jc w:val="left"/>
-              <w:pBdr>
-                <w:bottom w:val="none" w:sz="0" w:space="0" w:color="000000"/>
-                <w:top w:val="none" w:sz="0" w:space="0" w:color="000000"/>
-                <w:left w:val="none" w:sz="0" w:space="0" w:color="000000"/>
-                <w:right w:val="none" w:sz="0" w:space="0" w:color="000000"/>
-              </w:pBdr>
-              <w:spacing w:after="100" w:before="100" w:line="240"/>
-              <w:ind w:left="100" w:right="100" w:firstLine="0" w:firstLineChars="0"/>
-              <w:rPr>
-                <w:rFonts w:ascii="Arial" w:hAnsi="Arial" w:eastAsia="Arial" w:cs="Arial"/>
-                <w:i w:val="false"/>
-                <w:b w:val="false"/>
-                <w:u w:val="none"/>
-                <w:strike w:val="false"/>
-                <w:sz w:val="22"/>
-                <w:szCs w:val="22"/>
-                <w:color w:val="000000"/>
-              </w:rPr>
-            </w:pPr>
-            <w:r>
-              <w:rPr>
-                <w:rFonts w:ascii="Arial" w:hAnsi="Arial" w:eastAsia="Arial" w:cs="Arial"/>
+              <w:pStyle w:val="Normal"/>
+              <w:jc w:val="left"/>
+              <w:pBdr>
+                <w:bottom w:val="none" w:sz="0" w:space="0" w:color="000000"/>
+                <w:top w:val="none" w:sz="0" w:space="0" w:color="000000"/>
+                <w:left w:val="none" w:sz="0" w:space="0" w:color="000000"/>
+                <w:right w:val="none" w:sz="0" w:space="0" w:color="000000"/>
+              </w:pBdr>
+              <w:spacing w:after="100" w:before="100" w:line="240"/>
+              <w:ind w:left="100" w:right="100" w:firstLine="0" w:firstLineChars="0"/>
+              <w:rPr>
+                <w:rFonts w:ascii="Helvetica" w:hAnsi="Helvetica" w:eastAsia="Helvetica" w:cs="Helvetica"/>
+                <w:i w:val="false"/>
+                <w:b w:val="false"/>
+                <w:u w:val="none"/>
+                <w:strike w:val="false"/>
+                <w:sz w:val="22"/>
+                <w:szCs w:val="22"/>
+                <w:color w:val="000000"/>
+              </w:rPr>
+            </w:pPr>
+            <w:r>
+              <w:rPr>
+                <w:rFonts w:ascii="Helvetica" w:hAnsi="Helvetica" w:eastAsia="Helvetica" w:cs="Helvetica"/>
                 <w:i w:val="false"/>
                 <w:b w:val="false"/>
                 <w:u w:val="none"/>
@@ -2678,29 +2719,30 @@
           </w:tcPr>
           <w:p>
             <w:pPr>
-              <w:jc w:val="left"/>
-              <w:pBdr>
-                <w:bottom w:val="none" w:sz="0" w:space="0" w:color="000000"/>
-                <w:top w:val="none" w:sz="0" w:space="0" w:color="000000"/>
-                <w:left w:val="none" w:sz="0" w:space="0" w:color="000000"/>
-                <w:right w:val="none" w:sz="0" w:space="0" w:color="000000"/>
-              </w:pBdr>
-              <w:spacing w:after="100" w:before="100" w:line="240"/>
-              <w:ind w:left="100" w:right="100" w:firstLine="0" w:firstLineChars="0"/>
-              <w:rPr>
-                <w:rFonts w:ascii="Arial" w:hAnsi="Arial" w:eastAsia="Arial" w:cs="Arial"/>
-                <w:i w:val="false"/>
-                <w:b w:val="false"/>
-                <w:u w:val="none"/>
-                <w:strike w:val="false"/>
-                <w:sz w:val="22"/>
-                <w:szCs w:val="22"/>
-                <w:color w:val="000000"/>
-              </w:rPr>
-            </w:pPr>
-            <w:r>
-              <w:rPr>
-                <w:rFonts w:ascii="Arial" w:hAnsi="Arial" w:eastAsia="Arial" w:cs="Arial"/>
+              <w:pStyle w:val="Normal"/>
+              <w:jc w:val="left"/>
+              <w:pBdr>
+                <w:bottom w:val="none" w:sz="0" w:space="0" w:color="000000"/>
+                <w:top w:val="none" w:sz="0" w:space="0" w:color="000000"/>
+                <w:left w:val="none" w:sz="0" w:space="0" w:color="000000"/>
+                <w:right w:val="none" w:sz="0" w:space="0" w:color="000000"/>
+              </w:pBdr>
+              <w:spacing w:after="100" w:before="100" w:line="240"/>
+              <w:ind w:left="100" w:right="100" w:firstLine="0" w:firstLineChars="0"/>
+              <w:rPr>
+                <w:rFonts w:ascii="Helvetica" w:hAnsi="Helvetica" w:eastAsia="Helvetica" w:cs="Helvetica"/>
+                <w:i w:val="false"/>
+                <w:b w:val="false"/>
+                <w:u w:val="none"/>
+                <w:strike w:val="false"/>
+                <w:sz w:val="22"/>
+                <w:szCs w:val="22"/>
+                <w:color w:val="000000"/>
+              </w:rPr>
+            </w:pPr>
+            <w:r>
+              <w:rPr>
+                <w:rFonts w:ascii="Helvetica" w:hAnsi="Helvetica" w:eastAsia="Helvetica" w:cs="Helvetica"/>
                 <w:i w:val="false"/>
                 <w:b w:val="false"/>
                 <w:u w:val="none"/>

</xml_diff>

<commit_message>
removing num chronic diseases
</commit_message>
<xml_diff>
--- a/Output/Table_4_Correlation_Matrix.docx
+++ b/Output/Table_4_Correlation_Matrix.docx
@@ -17,23 +17,21 @@
         <w:tblLook w:firstRow="1" w:lastRow="0" w:firstColumn="0" w:lastColumn="0" w:noHBand="0" w:noVBand="1"/>
       </w:tblPr>
       <w:tblGrid>
-        <w:gridCol w:w="3112"/>
+        <w:gridCol w:w="3579"/>
         <w:gridCol w:w="1056"/>
         <w:gridCol w:w="1056"/>
         <w:gridCol w:w="1067"/>
-        <w:gridCol w:w="1056"/>
         <w:gridCol w:w="1067"/>
         <w:gridCol w:w="378"/>
       </w:tblGrid>
       <w:tr>
         <w:trPr>
-          <w:trHeight w:val="413" w:hRule="auto"/>
+          <w:trHeight w:val="470" w:hRule="auto"/>
           <w:tblHeader/>
         </w:trPr>
-        header1
-        <w:tc>
-          <w:tcPr>
-            <w:gridSpan w:val="7"/>
+        <w:tc>
+          <w:tcPr>
+            <w:gridSpan w:val="6"/>
             <w:tcBorders>
               <w:bottom w:val="single" w:sz="12" w:space="0" w:color="666666"/>
               <w:top w:val="single" w:sz="12" w:space="0" w:color="666666"/>
@@ -51,6 +49,7 @@
           </w:tcPr>
           <w:p>
             <w:pPr>
+              <w:pStyle w:val="Normal"/>
               <w:jc w:val="left"/>
               <w:pBdr>
                 <w:bottom w:val="none" w:sz="0" w:space="0" w:color="000000"/>
@@ -89,10 +88,9 @@
       </w:tr>
       <w:tr>
         <w:trPr>
-          <w:trHeight w:val="413" w:hRule="auto"/>
+          <w:trHeight w:val="470" w:hRule="auto"/>
           <w:tblHeader/>
         </w:trPr>
-        header2
         <w:tc>
           <w:tcPr>
             <w:tcBorders>
@@ -112,6 +110,7 @@
           </w:tcPr>
           <w:p>
             <w:pPr>
+              <w:pStyle w:val="Normal"/>
               <w:jc w:val="left"/>
               <w:pBdr>
                 <w:bottom w:val="none" w:sz="0" w:space="0" w:color="000000"/>
@@ -166,6 +165,7 @@
           </w:tcPr>
           <w:p>
             <w:pPr>
+              <w:pStyle w:val="Normal"/>
               <w:jc w:val="center"/>
               <w:pBdr>
                 <w:bottom w:val="none" w:sz="0" w:space="0" w:color="000000"/>
@@ -220,6 +220,7 @@
           </w:tcPr>
           <w:p>
             <w:pPr>
+              <w:pStyle w:val="Normal"/>
               <w:jc w:val="center"/>
               <w:pBdr>
                 <w:bottom w:val="none" w:sz="0" w:space="0" w:color="000000"/>
@@ -274,6 +275,7 @@
           </w:tcPr>
           <w:p>
             <w:pPr>
+              <w:pStyle w:val="Normal"/>
               <w:jc w:val="center"/>
               <w:pBdr>
                 <w:bottom w:val="none" w:sz="0" w:space="0" w:color="000000"/>
@@ -328,6 +330,7 @@
           </w:tcPr>
           <w:p>
             <w:pPr>
+              <w:pStyle w:val="Normal"/>
               <w:jc w:val="center"/>
               <w:pBdr>
                 <w:bottom w:val="none" w:sz="0" w:space="0" w:color="000000"/>
@@ -382,6 +385,7 @@
           </w:tcPr>
           <w:p>
             <w:pPr>
+              <w:pStyle w:val="Normal"/>
               <w:jc w:val="center"/>
               <w:pBdr>
                 <w:bottom w:val="none" w:sz="0" w:space="0" w:color="000000"/>
@@ -414,69 +418,14 @@
                 <w:color w:val="000000"/>
               </w:rPr>
               <w:t xml:space="preserve">5</w:t>
-            </w:r>
-          </w:p>
-        </w:tc>
-        <w:tc>
-          <w:tcPr>
-            <w:tcBorders>
-              <w:bottom w:val="single" w:sz="12" w:space="0" w:color="666666"/>
-              <w:top w:val="single" w:sz="12" w:space="0" w:color="666666"/>
-              <w:left w:val="none" w:sz="0" w:space="0" w:color="000000"/>
-              <w:right w:val="none" w:sz="0" w:space="0" w:color="000000"/>
-            </w:tcBorders>
-            <w:shd w:val="clear" w:color="auto" w:fill="FFFFFF"/>
-            <w:tcMar>
-              <w:top w:w="0" w:type="dxa"/>
-              <w:bottom w:w="0" w:type="dxa"/>
-              <w:left w:w="0" w:type="dxa"/>
-              <w:right w:w="0" w:type="dxa"/>
-            </w:tcMar>
-            <w:vAlign w:val="center"/>
-          </w:tcPr>
-          <w:p>
-            <w:pPr>
-              <w:jc w:val="center"/>
-              <w:pBdr>
-                <w:bottom w:val="none" w:sz="0" w:space="0" w:color="000000"/>
-                <w:top w:val="none" w:sz="0" w:space="0" w:color="000000"/>
-                <w:left w:val="none" w:sz="0" w:space="0" w:color="000000"/>
-                <w:right w:val="none" w:sz="0" w:space="0" w:color="000000"/>
-              </w:pBdr>
-              <w:spacing w:after="100" w:before="100" w:line="240"/>
-              <w:ind w:left="100" w:right="100" w:firstLine="0" w:firstLineChars="0"/>
-              <w:rPr>
-                <w:rFonts w:ascii="Arial" w:hAnsi="Arial" w:eastAsia="Arial" w:cs="Arial"/>
-                <w:i w:val="false"/>
-                <w:b w:val="true"/>
-                <w:u w:val="none"/>
-                <w:strike w:val="false"/>
-                <w:sz w:val="20"/>
-                <w:szCs w:val="20"/>
-                <w:color w:val="000000"/>
-              </w:rPr>
-            </w:pPr>
-            <w:r>
-              <w:rPr>
-                <w:rFonts w:ascii="Arial" w:hAnsi="Arial" w:eastAsia="Arial" w:cs="Arial"/>
-                <w:i w:val="false"/>
-                <w:b w:val="true"/>
-                <w:u w:val="none"/>
-                <w:strike w:val="false"/>
-                <w:sz w:val="20"/>
-                <w:szCs w:val="20"/>
-                <w:color w:val="000000"/>
-              </w:rPr>
-              <w:t xml:space="preserve">6</w:t>
             </w:r>
           </w:p>
         </w:tc>
       </w:tr>
       <w:tr>
         <w:trPr>
-          <w:trHeight w:val="454" w:hRule="auto"/>
+          <w:trHeight w:val="440" w:hRule="auto"/>
         </w:trPr>
-        body1
         <w:tc>
           <w:tcPr>
             <w:tcBorders>
@@ -496,6 +445,7 @@
           </w:tcPr>
           <w:p>
             <w:pPr>
+              <w:pStyle w:val="Normal"/>
               <w:jc w:val="left"/>
               <w:pBdr>
                 <w:bottom w:val="none" w:sz="0" w:space="0" w:color="000000"/>
@@ -527,7 +477,7 @@
                 <w:szCs w:val="20"/>
                 <w:color w:val="000000"/>
               </w:rPr>
-              <w:t xml:space="preserve">1. GrimAge2</w:t>
+              <w:t xml:space="preserve">1. GrimAge2 z-score</w:t>
             </w:r>
           </w:p>
         </w:tc>
@@ -550,6 +500,7 @@
           </w:tcPr>
           <w:p>
             <w:pPr>
+              <w:pStyle w:val="Normal"/>
               <w:jc w:val="center"/>
               <w:pBdr>
                 <w:bottom w:val="none" w:sz="0" w:space="0" w:color="000000"/>
@@ -604,6 +555,7 @@
           </w:tcPr>
           <w:p>
             <w:pPr>
+              <w:pStyle w:val="Normal"/>
               <w:jc w:val="center"/>
               <w:pBdr>
                 <w:bottom w:val="none" w:sz="0" w:space="0" w:color="000000"/>
@@ -658,6 +610,7 @@
           </w:tcPr>
           <w:p>
             <w:pPr>
+              <w:pStyle w:val="Normal"/>
               <w:jc w:val="center"/>
               <w:pBdr>
                 <w:bottom w:val="none" w:sz="0" w:space="0" w:color="000000"/>
@@ -712,6 +665,7 @@
           </w:tcPr>
           <w:p>
             <w:pPr>
+              <w:pStyle w:val="Normal"/>
               <w:jc w:val="center"/>
               <w:pBdr>
                 <w:bottom w:val="none" w:sz="0" w:space="0" w:color="000000"/>
@@ -766,60 +720,7 @@
           </w:tcPr>
           <w:p>
             <w:pPr>
-              <w:jc w:val="center"/>
-              <w:pBdr>
-                <w:bottom w:val="none" w:sz="0" w:space="0" w:color="000000"/>
-                <w:top w:val="none" w:sz="0" w:space="0" w:color="000000"/>
-                <w:left w:val="none" w:sz="0" w:space="0" w:color="000000"/>
-                <w:right w:val="none" w:sz="0" w:space="0" w:color="000000"/>
-              </w:pBdr>
-              <w:spacing w:after="100" w:before="100" w:line="240"/>
-              <w:ind w:left="100" w:right="100" w:firstLine="0" w:firstLineChars="0"/>
-              <w:rPr>
-                <w:rFonts w:ascii="Arial" w:hAnsi="Arial" w:eastAsia="Arial" w:cs="Arial"/>
-                <w:i w:val="false"/>
-                <w:b w:val="false"/>
-                <w:u w:val="none"/>
-                <w:strike w:val="false"/>
-                <w:sz w:val="20"/>
-                <w:szCs w:val="20"/>
-                <w:color w:val="000000"/>
-              </w:rPr>
-            </w:pPr>
-            <w:r>
-              <w:rPr>
-                <w:rFonts w:ascii="Arial" w:hAnsi="Arial" w:eastAsia="Arial" w:cs="Arial"/>
-                <w:i w:val="false"/>
-                <w:b w:val="false"/>
-                <w:u w:val="none"/>
-                <w:strike w:val="false"/>
-                <w:sz w:val="20"/>
-                <w:szCs w:val="20"/>
-                <w:color w:val="000000"/>
-              </w:rPr>
-              <w:t xml:space="preserve"/>
-            </w:r>
-          </w:p>
-        </w:tc>
-        <w:tc>
-          <w:tcPr>
-            <w:tcBorders>
-              <w:bottom w:val="none" w:sz="0" w:space="0" w:color="000000"/>
-              <w:top w:val="single" w:sz="12" w:space="0" w:color="666666"/>
-              <w:left w:val="none" w:sz="0" w:space="0" w:color="000000"/>
-              <w:right w:val="none" w:sz="0" w:space="0" w:color="000000"/>
-            </w:tcBorders>
-            <w:shd w:val="clear" w:color="auto" w:fill="FFFFFF"/>
-            <w:tcMar>
-              <w:top w:w="0" w:type="dxa"/>
-              <w:bottom w:w="0" w:type="dxa"/>
-              <w:left w:w="0" w:type="dxa"/>
-              <w:right w:w="0" w:type="dxa"/>
-            </w:tcMar>
-            <w:vAlign w:val="center"/>
-          </w:tcPr>
-          <w:p>
-            <w:pPr>
+              <w:pStyle w:val="Normal"/>
               <w:jc w:val="center"/>
               <w:pBdr>
                 <w:bottom w:val="none" w:sz="0" w:space="0" w:color="000000"/>
@@ -858,9 +759,8 @@
       </w:tr>
       <w:tr>
         <w:trPr>
-          <w:trHeight w:val="415" w:hRule="auto"/>
+          <w:trHeight w:val="440" w:hRule="auto"/>
         </w:trPr>
-        body2
         <w:tc>
           <w:tcPr>
             <w:tcBorders>
@@ -880,6 +780,7 @@
           </w:tcPr>
           <w:p>
             <w:pPr>
+              <w:pStyle w:val="Normal"/>
               <w:jc w:val="left"/>
               <w:pBdr>
                 <w:bottom w:val="none" w:sz="0" w:space="0" w:color="000000"/>
@@ -911,7 +812,7 @@
                 <w:szCs w:val="20"/>
                 <w:color w:val="000000"/>
               </w:rPr>
-              <w:t xml:space="preserve">2. DunedinPACE</w:t>
+              <w:t xml:space="preserve">2. DunedinPACE z-score</w:t>
             </w:r>
           </w:p>
         </w:tc>
@@ -934,6 +835,7 @@
           </w:tcPr>
           <w:p>
             <w:pPr>
+              <w:pStyle w:val="Normal"/>
               <w:jc w:val="center"/>
               <w:pBdr>
                 <w:bottom w:val="none" w:sz="0" w:space="0" w:color="000000"/>
@@ -988,6 +890,7 @@
           </w:tcPr>
           <w:p>
             <w:pPr>
+              <w:pStyle w:val="Normal"/>
               <w:jc w:val="center"/>
               <w:pBdr>
                 <w:bottom w:val="none" w:sz="0" w:space="0" w:color="000000"/>
@@ -1042,6 +945,7 @@
           </w:tcPr>
           <w:p>
             <w:pPr>
+              <w:pStyle w:val="Normal"/>
               <w:jc w:val="center"/>
               <w:pBdr>
                 <w:bottom w:val="none" w:sz="0" w:space="0" w:color="000000"/>
@@ -1096,6 +1000,7 @@
           </w:tcPr>
           <w:p>
             <w:pPr>
+              <w:pStyle w:val="Normal"/>
               <w:jc w:val="center"/>
               <w:pBdr>
                 <w:bottom w:val="none" w:sz="0" w:space="0" w:color="000000"/>
@@ -1150,60 +1055,7 @@
           </w:tcPr>
           <w:p>
             <w:pPr>
-              <w:jc w:val="center"/>
-              <w:pBdr>
-                <w:bottom w:val="none" w:sz="0" w:space="0" w:color="000000"/>
-                <w:top w:val="none" w:sz="0" w:space="0" w:color="000000"/>
-                <w:left w:val="none" w:sz="0" w:space="0" w:color="000000"/>
-                <w:right w:val="none" w:sz="0" w:space="0" w:color="000000"/>
-              </w:pBdr>
-              <w:spacing w:after="100" w:before="100" w:line="240"/>
-              <w:ind w:left="100" w:right="100" w:firstLine="0" w:firstLineChars="0"/>
-              <w:rPr>
-                <w:rFonts w:ascii="Arial" w:hAnsi="Arial" w:eastAsia="Arial" w:cs="Arial"/>
-                <w:i w:val="false"/>
-                <w:b w:val="false"/>
-                <w:u w:val="none"/>
-                <w:strike w:val="false"/>
-                <w:sz w:val="20"/>
-                <w:szCs w:val="20"/>
-                <w:color w:val="000000"/>
-              </w:rPr>
-            </w:pPr>
-            <w:r>
-              <w:rPr>
-                <w:rFonts w:ascii="Arial" w:hAnsi="Arial" w:eastAsia="Arial" w:cs="Arial"/>
-                <w:i w:val="false"/>
-                <w:b w:val="false"/>
-                <w:u w:val="none"/>
-                <w:strike w:val="false"/>
-                <w:sz w:val="20"/>
-                <w:szCs w:val="20"/>
-                <w:color w:val="000000"/>
-              </w:rPr>
-              <w:t xml:space="preserve"/>
-            </w:r>
-          </w:p>
-        </w:tc>
-        <w:tc>
-          <w:tcPr>
-            <w:tcBorders>
-              <w:bottom w:val="none" w:sz="0" w:space="0" w:color="000000"/>
-              <w:top w:val="none" w:sz="0" w:space="0" w:color="000000"/>
-              <w:left w:val="none" w:sz="0" w:space="0" w:color="000000"/>
-              <w:right w:val="none" w:sz="0" w:space="0" w:color="000000"/>
-            </w:tcBorders>
-            <w:shd w:val="clear" w:color="auto" w:fill="FFFFFF"/>
-            <w:tcMar>
-              <w:top w:w="0" w:type="dxa"/>
-              <w:bottom w:w="0" w:type="dxa"/>
-              <w:left w:w="0" w:type="dxa"/>
-              <w:right w:w="0" w:type="dxa"/>
-            </w:tcMar>
-            <w:vAlign w:val="center"/>
-          </w:tcPr>
-          <w:p>
-            <w:pPr>
+              <w:pStyle w:val="Normal"/>
               <w:jc w:val="center"/>
               <w:pBdr>
                 <w:bottom w:val="none" w:sz="0" w:space="0" w:color="000000"/>
@@ -1242,9 +1094,8 @@
       </w:tr>
       <w:tr>
         <w:trPr>
-          <w:trHeight w:val="453" w:hRule="auto"/>
+          <w:trHeight w:val="440" w:hRule="auto"/>
         </w:trPr>
-        body3
         <w:tc>
           <w:tcPr>
             <w:tcBorders>
@@ -1264,6 +1115,7 @@
           </w:tcPr>
           <w:p>
             <w:pPr>
+              <w:pStyle w:val="Normal"/>
               <w:jc w:val="left"/>
               <w:pBdr>
                 <w:bottom w:val="none" w:sz="0" w:space="0" w:color="000000"/>
@@ -1318,6 +1170,7 @@
           </w:tcPr>
           <w:p>
             <w:pPr>
+              <w:pStyle w:val="Normal"/>
               <w:jc w:val="center"/>
               <w:pBdr>
                 <w:bottom w:val="none" w:sz="0" w:space="0" w:color="000000"/>
@@ -1372,6 +1225,7 @@
           </w:tcPr>
           <w:p>
             <w:pPr>
+              <w:pStyle w:val="Normal"/>
               <w:jc w:val="center"/>
               <w:pBdr>
                 <w:bottom w:val="none" w:sz="0" w:space="0" w:color="000000"/>
@@ -1426,6 +1280,7 @@
           </w:tcPr>
           <w:p>
             <w:pPr>
+              <w:pStyle w:val="Normal"/>
               <w:jc w:val="center"/>
               <w:pBdr>
                 <w:bottom w:val="none" w:sz="0" w:space="0" w:color="000000"/>
@@ -1480,6 +1335,7 @@
           </w:tcPr>
           <w:p>
             <w:pPr>
+              <w:pStyle w:val="Normal"/>
               <w:jc w:val="center"/>
               <w:pBdr>
                 <w:bottom w:val="none" w:sz="0" w:space="0" w:color="000000"/>
@@ -1534,60 +1390,7 @@
           </w:tcPr>
           <w:p>
             <w:pPr>
-              <w:jc w:val="center"/>
-              <w:pBdr>
-                <w:bottom w:val="none" w:sz="0" w:space="0" w:color="000000"/>
-                <w:top w:val="none" w:sz="0" w:space="0" w:color="000000"/>
-                <w:left w:val="none" w:sz="0" w:space="0" w:color="000000"/>
-                <w:right w:val="none" w:sz="0" w:space="0" w:color="000000"/>
-              </w:pBdr>
-              <w:spacing w:after="100" w:before="100" w:line="240"/>
-              <w:ind w:left="100" w:right="100" w:firstLine="0" w:firstLineChars="0"/>
-              <w:rPr>
-                <w:rFonts w:ascii="Arial" w:hAnsi="Arial" w:eastAsia="Arial" w:cs="Arial"/>
-                <w:i w:val="false"/>
-                <w:b w:val="false"/>
-                <w:u w:val="none"/>
-                <w:strike w:val="false"/>
-                <w:sz w:val="20"/>
-                <w:szCs w:val="20"/>
-                <w:color w:val="000000"/>
-              </w:rPr>
-            </w:pPr>
-            <w:r>
-              <w:rPr>
-                <w:rFonts w:ascii="Arial" w:hAnsi="Arial" w:eastAsia="Arial" w:cs="Arial"/>
-                <w:i w:val="false"/>
-                <w:b w:val="false"/>
-                <w:u w:val="none"/>
-                <w:strike w:val="false"/>
-                <w:sz w:val="20"/>
-                <w:szCs w:val="20"/>
-                <w:color w:val="000000"/>
-              </w:rPr>
-              <w:t xml:space="preserve"/>
-            </w:r>
-          </w:p>
-        </w:tc>
-        <w:tc>
-          <w:tcPr>
-            <w:tcBorders>
-              <w:bottom w:val="none" w:sz="0" w:space="0" w:color="000000"/>
-              <w:top w:val="none" w:sz="0" w:space="0" w:color="000000"/>
-              <w:left w:val="none" w:sz="0" w:space="0" w:color="000000"/>
-              <w:right w:val="none" w:sz="0" w:space="0" w:color="000000"/>
-            </w:tcBorders>
-            <w:shd w:val="clear" w:color="auto" w:fill="FFFFFF"/>
-            <w:tcMar>
-              <w:top w:w="0" w:type="dxa"/>
-              <w:bottom w:w="0" w:type="dxa"/>
-              <w:left w:w="0" w:type="dxa"/>
-              <w:right w:w="0" w:type="dxa"/>
-            </w:tcMar>
-            <w:vAlign w:val="center"/>
-          </w:tcPr>
-          <w:p>
-            <w:pPr>
+              <w:pStyle w:val="Normal"/>
               <w:jc w:val="center"/>
               <w:pBdr>
                 <w:bottom w:val="none" w:sz="0" w:space="0" w:color="000000"/>
@@ -1626,9 +1429,8 @@
       </w:tr>
       <w:tr>
         <w:trPr>
-          <w:trHeight w:val="415" w:hRule="auto"/>
+          <w:trHeight w:val="440" w:hRule="auto"/>
         </w:trPr>
-        body4
         <w:tc>
           <w:tcPr>
             <w:tcBorders>
@@ -1648,6 +1450,7 @@
           </w:tcPr>
           <w:p>
             <w:pPr>
+              <w:pStyle w:val="Normal"/>
               <w:jc w:val="left"/>
               <w:pBdr>
                 <w:bottom w:val="none" w:sz="0" w:space="0" w:color="000000"/>
@@ -1679,7 +1482,7 @@
                 <w:szCs w:val="20"/>
                 <w:color w:val="000000"/>
               </w:rPr>
-              <w:t xml:space="preserve">4. Number of chronic conditions</w:t>
+              <w:t xml:space="preserve">4. Perceived cancer risk z-score</w:t>
             </w:r>
           </w:p>
         </w:tc>
@@ -1702,6 +1505,7 @@
           </w:tcPr>
           <w:p>
             <w:pPr>
+              <w:pStyle w:val="Normal"/>
               <w:jc w:val="center"/>
               <w:pBdr>
                 <w:bottom w:val="none" w:sz="0" w:space="0" w:color="000000"/>
@@ -1733,7 +1537,7 @@
                 <w:szCs w:val="20"/>
                 <w:color w:val="000000"/>
               </w:rPr>
-              <w:t xml:space="preserve"> 0.173***</w:t>
+              <w:t xml:space="preserve">-0.037</w:t>
             </w:r>
           </w:p>
         </w:tc>
@@ -1756,6 +1560,7 @@
           </w:tcPr>
           <w:p>
             <w:pPr>
+              <w:pStyle w:val="Normal"/>
               <w:jc w:val="center"/>
               <w:pBdr>
                 <w:bottom w:val="none" w:sz="0" w:space="0" w:color="000000"/>
@@ -1787,7 +1592,7 @@
                 <w:szCs w:val="20"/>
                 <w:color w:val="000000"/>
               </w:rPr>
-              <w:t xml:space="preserve"> 0.202***</w:t>
+              <w:t xml:space="preserve"> 0.062*</w:t>
             </w:r>
           </w:p>
         </w:tc>
@@ -1810,6 +1615,7 @@
           </w:tcPr>
           <w:p>
             <w:pPr>
+              <w:pStyle w:val="Normal"/>
               <w:jc w:val="center"/>
               <w:pBdr>
                 <w:bottom w:val="none" w:sz="0" w:space="0" w:color="000000"/>
@@ -1841,7 +1647,7 @@
                 <w:szCs w:val="20"/>
                 <w:color w:val="000000"/>
               </w:rPr>
-              <w:t xml:space="preserve"> 0.088**</w:t>
+              <w:t xml:space="preserve">-0.144***</w:t>
             </w:r>
           </w:p>
         </w:tc>
@@ -1864,6 +1670,7 @@
           </w:tcPr>
           <w:p>
             <w:pPr>
+              <w:pStyle w:val="Normal"/>
               <w:jc w:val="center"/>
               <w:pBdr>
                 <w:bottom w:val="none" w:sz="0" w:space="0" w:color="000000"/>
@@ -1918,60 +1725,7 @@
           </w:tcPr>
           <w:p>
             <w:pPr>
-              <w:jc w:val="center"/>
-              <w:pBdr>
-                <w:bottom w:val="none" w:sz="0" w:space="0" w:color="000000"/>
-                <w:top w:val="none" w:sz="0" w:space="0" w:color="000000"/>
-                <w:left w:val="none" w:sz="0" w:space="0" w:color="000000"/>
-                <w:right w:val="none" w:sz="0" w:space="0" w:color="000000"/>
-              </w:pBdr>
-              <w:spacing w:after="100" w:before="100" w:line="240"/>
-              <w:ind w:left="100" w:right="100" w:firstLine="0" w:firstLineChars="0"/>
-              <w:rPr>
-                <w:rFonts w:ascii="Arial" w:hAnsi="Arial" w:eastAsia="Arial" w:cs="Arial"/>
-                <w:i w:val="false"/>
-                <w:b w:val="false"/>
-                <w:u w:val="none"/>
-                <w:strike w:val="false"/>
-                <w:sz w:val="20"/>
-                <w:szCs w:val="20"/>
-                <w:color w:val="000000"/>
-              </w:rPr>
-            </w:pPr>
-            <w:r>
-              <w:rPr>
-                <w:rFonts w:ascii="Arial" w:hAnsi="Arial" w:eastAsia="Arial" w:cs="Arial"/>
-                <w:i w:val="false"/>
-                <w:b w:val="false"/>
-                <w:u w:val="none"/>
-                <w:strike w:val="false"/>
-                <w:sz w:val="20"/>
-                <w:szCs w:val="20"/>
-                <w:color w:val="000000"/>
-              </w:rPr>
-              <w:t xml:space="preserve"/>
-            </w:r>
-          </w:p>
-        </w:tc>
-        <w:tc>
-          <w:tcPr>
-            <w:tcBorders>
-              <w:bottom w:val="none" w:sz="0" w:space="0" w:color="000000"/>
-              <w:top w:val="none" w:sz="0" w:space="0" w:color="000000"/>
-              <w:left w:val="none" w:sz="0" w:space="0" w:color="000000"/>
-              <w:right w:val="none" w:sz="0" w:space="0" w:color="000000"/>
-            </w:tcBorders>
-            <w:shd w:val="clear" w:color="auto" w:fill="FFFFFF"/>
-            <w:tcMar>
-              <w:top w:w="0" w:type="dxa"/>
-              <w:bottom w:w="0" w:type="dxa"/>
-              <w:left w:w="0" w:type="dxa"/>
-              <w:right w:w="0" w:type="dxa"/>
-            </w:tcMar>
-            <w:vAlign w:val="center"/>
-          </w:tcPr>
-          <w:p>
-            <w:pPr>
+              <w:pStyle w:val="Normal"/>
               <w:jc w:val="center"/>
               <w:pBdr>
                 <w:bottom w:val="none" w:sz="0" w:space="0" w:color="000000"/>
@@ -2010,393 +1764,8 @@
       </w:tr>
       <w:tr>
         <w:trPr>
-          <w:trHeight w:val="415" w:hRule="auto"/>
+          <w:trHeight w:val="455" w:hRule="auto"/>
         </w:trPr>
-        body5
-        <w:tc>
-          <w:tcPr>
-            <w:tcBorders>
-              <w:bottom w:val="none" w:sz="0" w:space="0" w:color="000000"/>
-              <w:top w:val="none" w:sz="0" w:space="0" w:color="000000"/>
-              <w:left w:val="none" w:sz="0" w:space="0" w:color="000000"/>
-              <w:right w:val="none" w:sz="0" w:space="0" w:color="000000"/>
-            </w:tcBorders>
-            <w:shd w:val="clear" w:color="auto" w:fill="FFFFFF"/>
-            <w:tcMar>
-              <w:top w:w="0" w:type="dxa"/>
-              <w:bottom w:w="0" w:type="dxa"/>
-              <w:left w:w="0" w:type="dxa"/>
-              <w:right w:w="0" w:type="dxa"/>
-            </w:tcMar>
-            <w:vAlign w:val="center"/>
-          </w:tcPr>
-          <w:p>
-            <w:pPr>
-              <w:jc w:val="left"/>
-              <w:pBdr>
-                <w:bottom w:val="none" w:sz="0" w:space="0" w:color="000000"/>
-                <w:top w:val="none" w:sz="0" w:space="0" w:color="000000"/>
-                <w:left w:val="none" w:sz="0" w:space="0" w:color="000000"/>
-                <w:right w:val="none" w:sz="0" w:space="0" w:color="000000"/>
-              </w:pBdr>
-              <w:spacing w:after="100" w:before="100" w:line="240"/>
-              <w:ind w:left="100" w:right="100" w:firstLine="0" w:firstLineChars="0"/>
-              <w:rPr>
-                <w:rFonts w:ascii="Arial" w:hAnsi="Arial" w:eastAsia="Arial" w:cs="Arial"/>
-                <w:i w:val="false"/>
-                <w:b w:val="false"/>
-                <w:u w:val="none"/>
-                <w:strike w:val="false"/>
-                <w:sz w:val="20"/>
-                <w:szCs w:val="20"/>
-                <w:color w:val="000000"/>
-              </w:rPr>
-            </w:pPr>
-            <w:r>
-              <w:rPr>
-                <w:rFonts w:ascii="Arial" w:hAnsi="Arial" w:eastAsia="Arial" w:cs="Arial"/>
-                <w:i w:val="false"/>
-                <w:b w:val="false"/>
-                <w:u w:val="none"/>
-                <w:strike w:val="false"/>
-                <w:sz w:val="20"/>
-                <w:szCs w:val="20"/>
-                <w:color w:val="000000"/>
-              </w:rPr>
-              <w:t xml:space="preserve">5. Perceived cancer risk z-score</w:t>
-            </w:r>
-          </w:p>
-        </w:tc>
-        <w:tc>
-          <w:tcPr>
-            <w:tcBorders>
-              <w:bottom w:val="none" w:sz="0" w:space="0" w:color="000000"/>
-              <w:top w:val="none" w:sz="0" w:space="0" w:color="000000"/>
-              <w:left w:val="none" w:sz="0" w:space="0" w:color="000000"/>
-              <w:right w:val="none" w:sz="0" w:space="0" w:color="000000"/>
-            </w:tcBorders>
-            <w:shd w:val="clear" w:color="auto" w:fill="FFFFFF"/>
-            <w:tcMar>
-              <w:top w:w="0" w:type="dxa"/>
-              <w:bottom w:w="0" w:type="dxa"/>
-              <w:left w:w="0" w:type="dxa"/>
-              <w:right w:w="0" w:type="dxa"/>
-            </w:tcMar>
-            <w:vAlign w:val="center"/>
-          </w:tcPr>
-          <w:p>
-            <w:pPr>
-              <w:jc w:val="center"/>
-              <w:pBdr>
-                <w:bottom w:val="none" w:sz="0" w:space="0" w:color="000000"/>
-                <w:top w:val="none" w:sz="0" w:space="0" w:color="000000"/>
-                <w:left w:val="none" w:sz="0" w:space="0" w:color="000000"/>
-                <w:right w:val="none" w:sz="0" w:space="0" w:color="000000"/>
-              </w:pBdr>
-              <w:spacing w:after="100" w:before="100" w:line="240"/>
-              <w:ind w:left="100" w:right="100" w:firstLine="0" w:firstLineChars="0"/>
-              <w:rPr>
-                <w:rFonts w:ascii="Arial" w:hAnsi="Arial" w:eastAsia="Arial" w:cs="Arial"/>
-                <w:i w:val="false"/>
-                <w:b w:val="false"/>
-                <w:u w:val="none"/>
-                <w:strike w:val="false"/>
-                <w:sz w:val="20"/>
-                <w:szCs w:val="20"/>
-                <w:color w:val="000000"/>
-              </w:rPr>
-            </w:pPr>
-            <w:r>
-              <w:rPr>
-                <w:rFonts w:ascii="Arial" w:hAnsi="Arial" w:eastAsia="Arial" w:cs="Arial"/>
-                <w:i w:val="false"/>
-                <w:b w:val="false"/>
-                <w:u w:val="none"/>
-                <w:strike w:val="false"/>
-                <w:sz w:val="20"/>
-                <w:szCs w:val="20"/>
-                <w:color w:val="000000"/>
-              </w:rPr>
-              <w:t xml:space="preserve">-0.037</w:t>
-            </w:r>
-          </w:p>
-        </w:tc>
-        <w:tc>
-          <w:tcPr>
-            <w:tcBorders>
-              <w:bottom w:val="none" w:sz="0" w:space="0" w:color="000000"/>
-              <w:top w:val="none" w:sz="0" w:space="0" w:color="000000"/>
-              <w:left w:val="none" w:sz="0" w:space="0" w:color="000000"/>
-              <w:right w:val="none" w:sz="0" w:space="0" w:color="000000"/>
-            </w:tcBorders>
-            <w:shd w:val="clear" w:color="auto" w:fill="FFFFFF"/>
-            <w:tcMar>
-              <w:top w:w="0" w:type="dxa"/>
-              <w:bottom w:w="0" w:type="dxa"/>
-              <w:left w:w="0" w:type="dxa"/>
-              <w:right w:w="0" w:type="dxa"/>
-            </w:tcMar>
-            <w:vAlign w:val="center"/>
-          </w:tcPr>
-          <w:p>
-            <w:pPr>
-              <w:jc w:val="center"/>
-              <w:pBdr>
-                <w:bottom w:val="none" w:sz="0" w:space="0" w:color="000000"/>
-                <w:top w:val="none" w:sz="0" w:space="0" w:color="000000"/>
-                <w:left w:val="none" w:sz="0" w:space="0" w:color="000000"/>
-                <w:right w:val="none" w:sz="0" w:space="0" w:color="000000"/>
-              </w:pBdr>
-              <w:spacing w:after="100" w:before="100" w:line="240"/>
-              <w:ind w:left="100" w:right="100" w:firstLine="0" w:firstLineChars="0"/>
-              <w:rPr>
-                <w:rFonts w:ascii="Arial" w:hAnsi="Arial" w:eastAsia="Arial" w:cs="Arial"/>
-                <w:i w:val="false"/>
-                <w:b w:val="false"/>
-                <w:u w:val="none"/>
-                <w:strike w:val="false"/>
-                <w:sz w:val="20"/>
-                <w:szCs w:val="20"/>
-                <w:color w:val="000000"/>
-              </w:rPr>
-            </w:pPr>
-            <w:r>
-              <w:rPr>
-                <w:rFonts w:ascii="Arial" w:hAnsi="Arial" w:eastAsia="Arial" w:cs="Arial"/>
-                <w:i w:val="false"/>
-                <w:b w:val="false"/>
-                <w:u w:val="none"/>
-                <w:strike w:val="false"/>
-                <w:sz w:val="20"/>
-                <w:szCs w:val="20"/>
-                <w:color w:val="000000"/>
-              </w:rPr>
-              <w:t xml:space="preserve"> 0.062*</w:t>
-            </w:r>
-          </w:p>
-        </w:tc>
-        <w:tc>
-          <w:tcPr>
-            <w:tcBorders>
-              <w:bottom w:val="none" w:sz="0" w:space="0" w:color="000000"/>
-              <w:top w:val="none" w:sz="0" w:space="0" w:color="000000"/>
-              <w:left w:val="none" w:sz="0" w:space="0" w:color="000000"/>
-              <w:right w:val="none" w:sz="0" w:space="0" w:color="000000"/>
-            </w:tcBorders>
-            <w:shd w:val="clear" w:color="auto" w:fill="FFFFFF"/>
-            <w:tcMar>
-              <w:top w:w="0" w:type="dxa"/>
-              <w:bottom w:w="0" w:type="dxa"/>
-              <w:left w:w="0" w:type="dxa"/>
-              <w:right w:w="0" w:type="dxa"/>
-            </w:tcMar>
-            <w:vAlign w:val="center"/>
-          </w:tcPr>
-          <w:p>
-            <w:pPr>
-              <w:jc w:val="center"/>
-              <w:pBdr>
-                <w:bottom w:val="none" w:sz="0" w:space="0" w:color="000000"/>
-                <w:top w:val="none" w:sz="0" w:space="0" w:color="000000"/>
-                <w:left w:val="none" w:sz="0" w:space="0" w:color="000000"/>
-                <w:right w:val="none" w:sz="0" w:space="0" w:color="000000"/>
-              </w:pBdr>
-              <w:spacing w:after="100" w:before="100" w:line="240"/>
-              <w:ind w:left="100" w:right="100" w:firstLine="0" w:firstLineChars="0"/>
-              <w:rPr>
-                <w:rFonts w:ascii="Arial" w:hAnsi="Arial" w:eastAsia="Arial" w:cs="Arial"/>
-                <w:i w:val="false"/>
-                <w:b w:val="false"/>
-                <w:u w:val="none"/>
-                <w:strike w:val="false"/>
-                <w:sz w:val="20"/>
-                <w:szCs w:val="20"/>
-                <w:color w:val="000000"/>
-              </w:rPr>
-            </w:pPr>
-            <w:r>
-              <w:rPr>
-                <w:rFonts w:ascii="Arial" w:hAnsi="Arial" w:eastAsia="Arial" w:cs="Arial"/>
-                <w:i w:val="false"/>
-                <w:b w:val="false"/>
-                <w:u w:val="none"/>
-                <w:strike w:val="false"/>
-                <w:sz w:val="20"/>
-                <w:szCs w:val="20"/>
-                <w:color w:val="000000"/>
-              </w:rPr>
-              <w:t xml:space="preserve">-0.144***</w:t>
-            </w:r>
-          </w:p>
-        </w:tc>
-        <w:tc>
-          <w:tcPr>
-            <w:tcBorders>
-              <w:bottom w:val="none" w:sz="0" w:space="0" w:color="000000"/>
-              <w:top w:val="none" w:sz="0" w:space="0" w:color="000000"/>
-              <w:left w:val="none" w:sz="0" w:space="0" w:color="000000"/>
-              <w:right w:val="none" w:sz="0" w:space="0" w:color="000000"/>
-            </w:tcBorders>
-            <w:shd w:val="clear" w:color="auto" w:fill="FFFFFF"/>
-            <w:tcMar>
-              <w:top w:w="0" w:type="dxa"/>
-              <w:bottom w:w="0" w:type="dxa"/>
-              <w:left w:w="0" w:type="dxa"/>
-              <w:right w:w="0" w:type="dxa"/>
-            </w:tcMar>
-            <w:vAlign w:val="center"/>
-          </w:tcPr>
-          <w:p>
-            <w:pPr>
-              <w:jc w:val="center"/>
-              <w:pBdr>
-                <w:bottom w:val="none" w:sz="0" w:space="0" w:color="000000"/>
-                <w:top w:val="none" w:sz="0" w:space="0" w:color="000000"/>
-                <w:left w:val="none" w:sz="0" w:space="0" w:color="000000"/>
-                <w:right w:val="none" w:sz="0" w:space="0" w:color="000000"/>
-              </w:pBdr>
-              <w:spacing w:after="100" w:before="100" w:line="240"/>
-              <w:ind w:left="100" w:right="100" w:firstLine="0" w:firstLineChars="0"/>
-              <w:rPr>
-                <w:rFonts w:ascii="Arial" w:hAnsi="Arial" w:eastAsia="Arial" w:cs="Arial"/>
-                <w:i w:val="false"/>
-                <w:b w:val="false"/>
-                <w:u w:val="none"/>
-                <w:strike w:val="false"/>
-                <w:sz w:val="20"/>
-                <w:szCs w:val="20"/>
-                <w:color w:val="000000"/>
-              </w:rPr>
-            </w:pPr>
-            <w:r>
-              <w:rPr>
-                <w:rFonts w:ascii="Arial" w:hAnsi="Arial" w:eastAsia="Arial" w:cs="Arial"/>
-                <w:i w:val="false"/>
-                <w:b w:val="false"/>
-                <w:u w:val="none"/>
-                <w:strike w:val="false"/>
-                <w:sz w:val="20"/>
-                <w:szCs w:val="20"/>
-                <w:color w:val="000000"/>
-              </w:rPr>
-              <w:t xml:space="preserve"> 0.171***</w:t>
-            </w:r>
-          </w:p>
-        </w:tc>
-        <w:tc>
-          <w:tcPr>
-            <w:tcBorders>
-              <w:bottom w:val="none" w:sz="0" w:space="0" w:color="000000"/>
-              <w:top w:val="none" w:sz="0" w:space="0" w:color="000000"/>
-              <w:left w:val="none" w:sz="0" w:space="0" w:color="000000"/>
-              <w:right w:val="none" w:sz="0" w:space="0" w:color="000000"/>
-            </w:tcBorders>
-            <w:shd w:val="clear" w:color="auto" w:fill="FFFFFF"/>
-            <w:tcMar>
-              <w:top w:w="0" w:type="dxa"/>
-              <w:bottom w:w="0" w:type="dxa"/>
-              <w:left w:w="0" w:type="dxa"/>
-              <w:right w:w="0" w:type="dxa"/>
-            </w:tcMar>
-            <w:vAlign w:val="center"/>
-          </w:tcPr>
-          <w:p>
-            <w:pPr>
-              <w:jc w:val="center"/>
-              <w:pBdr>
-                <w:bottom w:val="none" w:sz="0" w:space="0" w:color="000000"/>
-                <w:top w:val="none" w:sz="0" w:space="0" w:color="000000"/>
-                <w:left w:val="none" w:sz="0" w:space="0" w:color="000000"/>
-                <w:right w:val="none" w:sz="0" w:space="0" w:color="000000"/>
-              </w:pBdr>
-              <w:spacing w:after="100" w:before="100" w:line="240"/>
-              <w:ind w:left="100" w:right="100" w:firstLine="0" w:firstLineChars="0"/>
-              <w:rPr>
-                <w:rFonts w:ascii="Arial" w:hAnsi="Arial" w:eastAsia="Arial" w:cs="Arial"/>
-                <w:i w:val="false"/>
-                <w:b w:val="false"/>
-                <w:u w:val="none"/>
-                <w:strike w:val="false"/>
-                <w:sz w:val="20"/>
-                <w:szCs w:val="20"/>
-                <w:color w:val="000000"/>
-              </w:rPr>
-            </w:pPr>
-            <w:r>
-              <w:rPr>
-                <w:rFonts w:ascii="Arial" w:hAnsi="Arial" w:eastAsia="Arial" w:cs="Arial"/>
-                <w:i w:val="false"/>
-                <w:b w:val="false"/>
-                <w:u w:val="none"/>
-                <w:strike w:val="false"/>
-                <w:sz w:val="20"/>
-                <w:szCs w:val="20"/>
-                <w:color w:val="000000"/>
-              </w:rPr>
-              <w:t xml:space="preserve"/>
-            </w:r>
-          </w:p>
-        </w:tc>
-        <w:tc>
-          <w:tcPr>
-            <w:tcBorders>
-              <w:bottom w:val="none" w:sz="0" w:space="0" w:color="000000"/>
-              <w:top w:val="none" w:sz="0" w:space="0" w:color="000000"/>
-              <w:left w:val="none" w:sz="0" w:space="0" w:color="000000"/>
-              <w:right w:val="none" w:sz="0" w:space="0" w:color="000000"/>
-            </w:tcBorders>
-            <w:shd w:val="clear" w:color="auto" w:fill="FFFFFF"/>
-            <w:tcMar>
-              <w:top w:w="0" w:type="dxa"/>
-              <w:bottom w:w="0" w:type="dxa"/>
-              <w:left w:w="0" w:type="dxa"/>
-              <w:right w:w="0" w:type="dxa"/>
-            </w:tcMar>
-            <w:vAlign w:val="center"/>
-          </w:tcPr>
-          <w:p>
-            <w:pPr>
-              <w:jc w:val="center"/>
-              <w:pBdr>
-                <w:bottom w:val="none" w:sz="0" w:space="0" w:color="000000"/>
-                <w:top w:val="none" w:sz="0" w:space="0" w:color="000000"/>
-                <w:left w:val="none" w:sz="0" w:space="0" w:color="000000"/>
-                <w:right w:val="none" w:sz="0" w:space="0" w:color="000000"/>
-              </w:pBdr>
-              <w:spacing w:after="100" w:before="100" w:line="240"/>
-              <w:ind w:left="100" w:right="100" w:firstLine="0" w:firstLineChars="0"/>
-              <w:rPr>
-                <w:rFonts w:ascii="Arial" w:hAnsi="Arial" w:eastAsia="Arial" w:cs="Arial"/>
-                <w:i w:val="false"/>
-                <w:b w:val="false"/>
-                <w:u w:val="none"/>
-                <w:strike w:val="false"/>
-                <w:sz w:val="20"/>
-                <w:szCs w:val="20"/>
-                <w:color w:val="000000"/>
-              </w:rPr>
-            </w:pPr>
-            <w:r>
-              <w:rPr>
-                <w:rFonts w:ascii="Arial" w:hAnsi="Arial" w:eastAsia="Arial" w:cs="Arial"/>
-                <w:i w:val="false"/>
-                <w:b w:val="false"/>
-                <w:u w:val="none"/>
-                <w:strike w:val="false"/>
-                <w:sz w:val="20"/>
-                <w:szCs w:val="20"/>
-                <w:color w:val="000000"/>
-              </w:rPr>
-              <w:t xml:space="preserve"/>
-            </w:r>
-          </w:p>
-        </w:tc>
-      </w:tr>
-      <w:tr>
-        <w:trPr>
-          <w:trHeight w:val="454" w:hRule="auto"/>
-        </w:trPr>
-        body6
         <w:tc>
           <w:tcPr>
             <w:tcBorders>
@@ -2416,6 +1785,7 @@
           </w:tcPr>
           <w:p>
             <w:pPr>
+              <w:pStyle w:val="Normal"/>
               <w:jc w:val="left"/>
               <w:pBdr>
                 <w:bottom w:val="none" w:sz="0" w:space="0" w:color="000000"/>
@@ -2447,7 +1817,7 @@
                 <w:szCs w:val="20"/>
                 <w:color w:val="000000"/>
               </w:rPr>
-              <w:t xml:space="preserve">6. Self-efficacy</w:t>
+              <w:t xml:space="preserve">5. Self-efficacy for Cancer Prevention</w:t>
             </w:r>
           </w:p>
         </w:tc>
@@ -2470,6 +1840,7 @@
           </w:tcPr>
           <w:p>
             <w:pPr>
+              <w:pStyle w:val="Normal"/>
               <w:jc w:val="center"/>
               <w:pBdr>
                 <w:bottom w:val="none" w:sz="0" w:space="0" w:color="000000"/>
@@ -2524,6 +1895,7 @@
           </w:tcPr>
           <w:p>
             <w:pPr>
+              <w:pStyle w:val="Normal"/>
               <w:jc w:val="center"/>
               <w:pBdr>
                 <w:bottom w:val="none" w:sz="0" w:space="0" w:color="000000"/>
@@ -2578,6 +1950,7 @@
           </w:tcPr>
           <w:p>
             <w:pPr>
+              <w:pStyle w:val="Normal"/>
               <w:jc w:val="center"/>
               <w:pBdr>
                 <w:bottom w:val="none" w:sz="0" w:space="0" w:color="000000"/>
@@ -2632,6 +2005,7 @@
           </w:tcPr>
           <w:p>
             <w:pPr>
+              <w:pStyle w:val="Normal"/>
               <w:jc w:val="center"/>
               <w:pBdr>
                 <w:bottom w:val="none" w:sz="0" w:space="0" w:color="000000"/>
@@ -2663,7 +2037,7 @@
                 <w:szCs w:val="20"/>
                 <w:color w:val="000000"/>
               </w:rPr>
-              <w:t xml:space="preserve">-0.035</w:t>
+              <w:t xml:space="preserve">-0.120***</w:t>
             </w:r>
           </w:p>
         </w:tc>
@@ -2686,60 +2060,7 @@
           </w:tcPr>
           <w:p>
             <w:pPr>
-              <w:jc w:val="center"/>
-              <w:pBdr>
-                <w:bottom w:val="none" w:sz="0" w:space="0" w:color="000000"/>
-                <w:top w:val="none" w:sz="0" w:space="0" w:color="000000"/>
-                <w:left w:val="none" w:sz="0" w:space="0" w:color="000000"/>
-                <w:right w:val="none" w:sz="0" w:space="0" w:color="000000"/>
-              </w:pBdr>
-              <w:spacing w:after="100" w:before="100" w:line="240"/>
-              <w:ind w:left="100" w:right="100" w:firstLine="0" w:firstLineChars="0"/>
-              <w:rPr>
-                <w:rFonts w:ascii="Arial" w:hAnsi="Arial" w:eastAsia="Arial" w:cs="Arial"/>
-                <w:i w:val="false"/>
-                <w:b w:val="false"/>
-                <w:u w:val="none"/>
-                <w:strike w:val="false"/>
-                <w:sz w:val="20"/>
-                <w:szCs w:val="20"/>
-                <w:color w:val="000000"/>
-              </w:rPr>
-            </w:pPr>
-            <w:r>
-              <w:rPr>
-                <w:rFonts w:ascii="Arial" w:hAnsi="Arial" w:eastAsia="Arial" w:cs="Arial"/>
-                <w:i w:val="false"/>
-                <w:b w:val="false"/>
-                <w:u w:val="none"/>
-                <w:strike w:val="false"/>
-                <w:sz w:val="20"/>
-                <w:szCs w:val="20"/>
-                <w:color w:val="000000"/>
-              </w:rPr>
-              <w:t xml:space="preserve">-0.120***</w:t>
-            </w:r>
-          </w:p>
-        </w:tc>
-        <w:tc>
-          <w:tcPr>
-            <w:tcBorders>
-              <w:bottom w:val="single" w:sz="12" w:space="0" w:color="666666"/>
-              <w:top w:val="none" w:sz="0" w:space="0" w:color="000000"/>
-              <w:left w:val="none" w:sz="0" w:space="0" w:color="000000"/>
-              <w:right w:val="none" w:sz="0" w:space="0" w:color="000000"/>
-            </w:tcBorders>
-            <w:shd w:val="clear" w:color="auto" w:fill="FFFFFF"/>
-            <w:tcMar>
-              <w:top w:w="0" w:type="dxa"/>
-              <w:bottom w:w="0" w:type="dxa"/>
-              <w:left w:w="0" w:type="dxa"/>
-              <w:right w:w="0" w:type="dxa"/>
-            </w:tcMar>
-            <w:vAlign w:val="center"/>
-          </w:tcPr>
-          <w:p>
-            <w:pPr>
+              <w:pStyle w:val="Normal"/>
               <w:jc w:val="center"/>
               <w:pBdr>
                 <w:bottom w:val="none" w:sz="0" w:space="0" w:color="000000"/>
@@ -2780,10 +2101,9 @@
         <w:trPr>
           <w:trHeight w:val="360" w:hRule="auto"/>
         </w:trPr>
-        footer1
-        <w:tc>
-          <w:tcPr>
-            <w:gridSpan w:val="7"/>
+        <w:tc>
+          <w:tcPr>
+            <w:gridSpan w:val="6"/>
             <w:tcBorders>
               <w:bottom w:val="none" w:sz="0" w:space="0" w:color="FFFFFF"/>
               <w:top w:val="single" w:sz="12" w:space="0" w:color="666666"/>
@@ -2801,6 +2121,7 @@
           </w:tcPr>
           <w:p>
             <w:pPr>
+              <w:pStyle w:val="Normal"/>
               <w:jc w:val="left"/>
               <w:pBdr>
                 <w:bottom w:val="none" w:sz="0" w:space="0" w:color="000000"/>

</xml_diff>